<commit_message>
:wrench: chore: Arrumando validações com base na Data Annotation de ProductType
</commit_message>
<xml_diff>
--- a/Documents/Documents/Sprint07_Task077_Implementar_Validacoes_Para_A_Classe_ProductType.docx
+++ b/Documents/Documents/Sprint07_Task077_Implementar_Validacoes_Para_A_Classe_ProductType.docx
@@ -1,10 +1,10 @@
 
 <file path=word/document.xml><?xml version="1.0" encoding="utf-8"?>
-<w:document xmlns:wp14="http://schemas.microsoft.com/office/word/2010/wordprocessingDrawing" xmlns:mc="http://schemas.openxmlformats.org/markup-compatibility/2006" xmlns:ve="http://schemas.openxmlformats.org/markup-compatibility/2006" xmlns:o="urn:schemas-microsoft-com:office:office" xmlns:r="http://schemas.openxmlformats.org/officeDocument/2006/relationships" xmlns:m="http://schemas.openxmlformats.org/officeDocument/2006/math" xmlns:v="urn:schemas-microsoft-com:vml" xmlns:wp="http://schemas.openxmlformats.org/drawingml/2006/wordprocessingDrawing" xmlns:w10="urn:schemas-microsoft-com:office:word" xmlns:w="http://schemas.openxmlformats.org/wordprocessingml/2006/main" xmlns:wne="http://schemas.microsoft.com/office/word/2006/wordml" xmlns:a="http://schemas.openxmlformats.org/drawingml/2006/main" xmlns:pic="http://schemas.openxmlformats.org/drawingml/2006/picture" xmlns:wpg="http://schemas.microsoft.com/office/word/2010/wordprocessingGroup" xmlns:wps="http://schemas.microsoft.com/office/word/2010/wordprocessingShape" xmlns:w14="http://schemas.microsoft.com/office/word/2010/wordml" xmlns:a14="http://schemas.microsoft.com/office/drawing/2010/main" mc:Ignorable="w14 wp14" xml:space="preserve">
+<w:document xmlns:wpc="http://schemas.microsoft.com/office/word/2010/wordprocessingCanvas" xmlns:cx="http://schemas.microsoft.com/office/drawing/2014/chartex" xmlns:cx1="http://schemas.microsoft.com/office/drawing/2015/9/8/chartex" xmlns:cx2="http://schemas.microsoft.com/office/drawing/2015/10/21/chartex" xmlns:cx3="http://schemas.microsoft.com/office/drawing/2016/5/9/chartex" xmlns:cx4="http://schemas.microsoft.com/office/drawing/2016/5/10/chartex" xmlns:cx5="http://schemas.microsoft.com/office/drawing/2016/5/11/chartex" xmlns:cx6="http://schemas.microsoft.com/office/drawing/2016/5/12/chartex" xmlns:cx7="http://schemas.microsoft.com/office/drawing/2016/5/13/chartex" xmlns:cx8="http://schemas.microsoft.com/office/drawing/2016/5/14/chartex" xmlns:mc="http://schemas.openxmlformats.org/markup-compatibility/2006" xmlns:aink="http://schemas.microsoft.com/office/drawing/2016/ink" xmlns:am3d="http://schemas.microsoft.com/office/drawing/2017/model3d" xmlns:o="urn:schemas-microsoft-com:office:office" xmlns:oel="http://schemas.microsoft.com/office/2019/extlst" xmlns:r="http://schemas.openxmlformats.org/officeDocument/2006/relationships" xmlns:m="http://schemas.openxmlformats.org/officeDocument/2006/math" xmlns:v="urn:schemas-microsoft-com:vml" xmlns:wp14="http://schemas.microsoft.com/office/word/2010/wordprocessingDrawing" xmlns:wp="http://schemas.openxmlformats.org/drawingml/2006/wordprocessingDrawing" xmlns:w10="urn:schemas-microsoft-com:office:word" xmlns:w="http://schemas.openxmlformats.org/wordprocessingml/2006/main" xmlns:w14="http://schemas.microsoft.com/office/word/2010/wordml" xmlns:w15="http://schemas.microsoft.com/office/word/2012/wordml" xmlns:w16cex="http://schemas.microsoft.com/office/word/2018/wordml/cex" xmlns:w16cid="http://schemas.microsoft.com/office/word/2016/wordml/cid" xmlns:w16="http://schemas.microsoft.com/office/word/2018/wordml" xmlns:w16du="http://schemas.microsoft.com/office/word/2023/wordml/word16du" xmlns:w16sdtdh="http://schemas.microsoft.com/office/word/2020/wordml/sdtdatahash" xmlns:w16sdtfl="http://schemas.microsoft.com/office/word/2024/wordml/sdtformatlock" xmlns:w16se="http://schemas.microsoft.com/office/word/2015/wordml/symex" xmlns:wpg="http://schemas.microsoft.com/office/word/2010/wordprocessingGroup" xmlns:wpi="http://schemas.microsoft.com/office/word/2010/wordprocessingInk" xmlns:wne="http://schemas.microsoft.com/office/word/2006/wordml" xmlns:wps="http://schemas.microsoft.com/office/word/2010/wordprocessingShape" mc:Ignorable="w14 w15 w16se w16cid w16 w16cex w16sdtdh w16sdtfl w16du wp14">
   <w:body>
-    <w:p xmlns:wp14="http://schemas.microsoft.com/office/word/2010/wordml" wp14:textId="77777777">
-      <w:pPr>
-        <w:pStyle w:val="BodyText"/>
+    <w:p>
+      <w:pPr>
+        <w:pStyle w:val="Corpodetexto"/>
         <w:ind w:left="2120"/>
         <w:rPr>
           <w:rFonts w:ascii="Times New Roman"/>
@@ -14,25 +14,26 @@
       <w:r>
         <w:rPr>
           <w:rFonts w:ascii="Times New Roman"/>
+          <w:noProof/>
           <w:sz w:val="20"/>
         </w:rPr>
         <w:drawing>
-          <wp:inline xmlns:wp14="http://schemas.microsoft.com/office/word/2010/wordprocessingDrawing" distT="0" distB="0" distL="0" distR="0" wp14:anchorId="7ED82FD2" wp14:editId="7777777">
+          <wp:inline distT="0" distB="0" distL="0" distR="0" wp14:anchorId="7ED82FD2" wp14:editId="07777777">
             <wp:extent cx="4109683" cy="732091"/>
             <wp:effectExtent l="0" t="0" r="0" b="0"/>
             <wp:docPr id="1" name="Image 1" descr="\\10.67.95.250\biblioteca\BIBLIOTECA\Identidade visual CPS\Cabeçalho Fatec Jales_eleição2.png"/>
             <wp:cNvGraphicFramePr>
-              <a:graphicFrameLocks/>
+              <a:graphicFrameLocks xmlns:a="http://schemas.openxmlformats.org/drawingml/2006/main"/>
             </wp:cNvGraphicFramePr>
-            <a:graphic>
+            <a:graphic xmlns:a="http://schemas.openxmlformats.org/drawingml/2006/main">
               <a:graphicData uri="http://schemas.openxmlformats.org/drawingml/2006/picture">
-                <pic:pic>
+                <pic:pic xmlns:pic="http://schemas.openxmlformats.org/drawingml/2006/picture">
                   <pic:nvPicPr>
                     <pic:cNvPr id="1" name="Image 1" descr="\\10.67.95.250\biblioteca\BIBLIOTECA\Identidade visual CPS\Cabeçalho Fatec Jales_eleição2.png"/>
                     <pic:cNvPicPr/>
                   </pic:nvPicPr>
                   <pic:blipFill>
-                    <a:blip r:embed="rId5" cstate="print"/>
+                    <a:blip r:embed="rId4" cstate="print"/>
                     <a:stretch>
                       <a:fillRect/>
                     </a:stretch>
@@ -52,16 +53,10 @@
           </wp:inline>
         </w:drawing>
       </w:r>
-      <w:r>
-        <w:rPr>
-          <w:rFonts w:ascii="Times New Roman"/>
-          <w:sz w:val="20"/>
-        </w:rPr>
-      </w:r>
-    </w:p>
-    <w:p xmlns:wp14="http://schemas.microsoft.com/office/word/2010/wordml" wp14:textId="77777777">
-      <w:pPr>
-        <w:pStyle w:val="BodyText"/>
+    </w:p>
+    <w:p>
+      <w:pPr>
+        <w:pStyle w:val="Corpodetexto"/>
         <w:spacing w:before="1" w:after="1"/>
         <w:rPr>
           <w:rFonts w:ascii="Times New Roman"/>
@@ -72,21 +67,18 @@
     <w:tbl>
       <w:tblPr>
         <w:tblW w:w="0" w:type="auto"/>
-        <w:jc w:val="left"/>
         <w:tblInd w:w="297" w:type="dxa"/>
         <w:tblBorders>
-          <w:top w:val="single" w:color="000000" w:themeColor="text1" w:sz="4" w:space="0"/>
-          <w:left w:val="single" w:color="000000" w:themeColor="text1" w:sz="4" w:space="0"/>
-          <w:bottom w:val="single" w:color="000000" w:themeColor="text1" w:sz="4" w:space="0"/>
-          <w:right w:val="single" w:color="000000" w:themeColor="text1" w:sz="4" w:space="0"/>
-          <w:insideH w:val="single" w:color="000000" w:themeColor="text1" w:sz="4" w:space="0"/>
-          <w:insideV w:val="single" w:color="000000" w:themeColor="text1" w:sz="4" w:space="0"/>
+          <w:top w:val="single" w:sz="4" w:space="0" w:color="000000" w:themeColor="text1"/>
+          <w:left w:val="single" w:sz="4" w:space="0" w:color="000000" w:themeColor="text1"/>
+          <w:bottom w:val="single" w:sz="4" w:space="0" w:color="000000" w:themeColor="text1"/>
+          <w:right w:val="single" w:sz="4" w:space="0" w:color="000000" w:themeColor="text1"/>
+          <w:insideH w:val="single" w:sz="4" w:space="0" w:color="000000" w:themeColor="text1"/>
+          <w:insideV w:val="single" w:sz="4" w:space="0" w:color="000000" w:themeColor="text1"/>
         </w:tblBorders>
         <w:tblLayout w:type="fixed"/>
         <w:tblCellMar>
-          <w:top w:w="0" w:type="dxa"/>
           <w:left w:w="0" w:type="dxa"/>
-          <w:bottom w:w="0" w:type="dxa"/>
           <w:right w:w="0" w:type="dxa"/>
         </w:tblCellMar>
         <w:tblLook w:val="01E0" w:firstRow="1" w:lastRow="1" w:firstColumn="1" w:lastColumn="1" w:noHBand="0" w:noVBand="0"/>
@@ -96,9 +88,9 @@
         <w:gridCol w:w="2833"/>
         <w:gridCol w:w="4542"/>
       </w:tblGrid>
-      <w:tr xmlns:wp14="http://schemas.microsoft.com/office/word/2010/wordml" wp14:textId="77777777">
+      <w:tr>
         <w:trPr>
-          <w:trHeight w:val="364" w:hRule="atLeast"/>
+          <w:trHeight w:val="364"/>
         </w:trPr>
         <w:tc>
           <w:tcPr>
@@ -110,9 +102,8 @@
               <w:right w:val="nil"/>
             </w:tcBorders>
             <w:shd w:val="clear" w:color="auto" w:fill="000000" w:themeFill="text1"/>
-            <w:tcMar/>
-          </w:tcPr>
-          <w:p wp14:textId="77777777">
+          </w:tcPr>
+          <w:p>
             <w:pPr>
               <w:pStyle w:val="TableParagraph"/>
               <w:spacing w:before="7" w:line="338" w:lineRule="exact"/>
@@ -139,7 +130,7 @@
                 <w:spacing w:val="-17"/>
                 <w:sz w:val="28"/>
               </w:rPr>
-              <w:t> </w:t>
+              <w:t xml:space="preserve"> </w:t>
             </w:r>
             <w:r>
               <w:rPr>
@@ -153,64 +144,53 @@
           </w:p>
         </w:tc>
       </w:tr>
-      <w:tr xmlns:wp14="http://schemas.microsoft.com/office/word/2010/wordml" wp14:textId="77777777">
+      <w:tr>
         <w:trPr>
-          <w:trHeight w:val="254" w:hRule="atLeast"/>
+          <w:trHeight w:val="254"/>
         </w:trPr>
         <w:tc>
           <w:tcPr>
             <w:tcW w:w="2831" w:type="dxa"/>
-            <w:tcMar/>
-          </w:tcPr>
-          <w:p wp14:textId="2D8D187C">
+          </w:tcPr>
+          <w:p>
             <w:pPr>
               <w:pStyle w:val="TableParagraph"/>
               <w:spacing w:line="234" w:lineRule="exact"/>
               <w:ind w:left="110"/>
               <w:rPr>
-                <w:b w:val="1"/>
-                <w:bCs w:val="1"/>
-                <w:sz w:val="22"/>
-                <w:szCs w:val="22"/>
-              </w:rPr>
-            </w:pPr>
-            <w:r>
-              <w:rPr>
-                <w:b w:val="1"/>
-                <w:bCs w:val="1"/>
+                <w:b/>
+                <w:bCs/>
+              </w:rPr>
+            </w:pPr>
+            <w:r>
+              <w:rPr>
+                <w:b/>
+                <w:bCs/>
                 <w:spacing w:val="-6"/>
-                <w:sz w:val="22"/>
-                <w:szCs w:val="22"/>
               </w:rPr>
               <w:t>Sprint</w:t>
             </w:r>
             <w:r>
               <w:rPr>
-                <w:b w:val="1"/>
-                <w:bCs w:val="1"/>
+                <w:b/>
+                <w:bCs/>
                 <w:spacing w:val="-7"/>
-                <w:sz w:val="22"/>
-                <w:szCs w:val="22"/>
               </w:rPr>
               <w:t xml:space="preserve"> </w:t>
             </w:r>
             <w:r>
               <w:rPr>
-                <w:b w:val="1"/>
-                <w:bCs w:val="1"/>
+                <w:b/>
+                <w:bCs/>
                 <w:spacing w:val="-5"/>
-                <w:sz w:val="22"/>
-                <w:szCs w:val="22"/>
               </w:rPr>
               <w:t>#0</w:t>
             </w:r>
             <w:r>
               <w:rPr>
-                <w:b w:val="1"/>
-                <w:bCs w:val="1"/>
+                <w:b/>
+                <w:bCs/>
                 <w:spacing w:val="-5"/>
-                <w:sz w:val="22"/>
-                <w:szCs w:val="22"/>
               </w:rPr>
               <w:t>7</w:t>
             </w:r>
@@ -219,107 +199,86 @@
         <w:tc>
           <w:tcPr>
             <w:tcW w:w="2833" w:type="dxa"/>
-            <w:tcMar/>
-          </w:tcPr>
-          <w:p wp14:textId="58DC4B5D">
+          </w:tcPr>
+          <w:p>
             <w:pPr>
               <w:pStyle w:val="TableParagraph"/>
               <w:spacing w:line="234" w:lineRule="exact"/>
               <w:ind w:left="109"/>
               <w:rPr>
-                <w:b w:val="1"/>
-                <w:bCs w:val="1"/>
-                <w:sz w:val="22"/>
-                <w:szCs w:val="22"/>
-              </w:rPr>
-            </w:pPr>
-            <w:r>
-              <w:rPr>
-                <w:b w:val="1"/>
-                <w:bCs w:val="1"/>
+                <w:b/>
+                <w:bCs/>
+              </w:rPr>
+            </w:pPr>
+            <w:r>
+              <w:rPr>
+                <w:b/>
+                <w:bCs/>
                 <w:spacing w:val="-4"/>
-                <w:sz w:val="22"/>
-                <w:szCs w:val="22"/>
               </w:rPr>
               <w:t>Start</w:t>
             </w:r>
             <w:r>
               <w:rPr>
-                <w:b w:val="1"/>
-                <w:bCs w:val="1"/>
+                <w:b/>
+                <w:bCs/>
                 <w:spacing w:val="-25"/>
-                <w:sz w:val="22"/>
-                <w:szCs w:val="22"/>
               </w:rPr>
               <w:t xml:space="preserve"> </w:t>
             </w:r>
             <w:r>
               <w:rPr>
-                <w:b w:val="1"/>
-                <w:bCs w:val="1"/>
+                <w:b/>
+                <w:bCs/>
                 <w:spacing w:val="-4"/>
-                <w:sz w:val="22"/>
-                <w:szCs w:val="22"/>
               </w:rPr>
               <w:t>Date:</w:t>
             </w:r>
             <w:r>
               <w:rPr>
-                <w:b w:val="1"/>
-                <w:bCs w:val="1"/>
+                <w:b/>
+                <w:bCs/>
                 <w:spacing w:val="-24"/>
-                <w:sz w:val="22"/>
-                <w:szCs w:val="22"/>
               </w:rPr>
               <w:t xml:space="preserve"> </w:t>
             </w:r>
             <w:r>
               <w:rPr>
-                <w:b w:val="1"/>
-                <w:bCs w:val="1"/>
+                <w:b/>
+                <w:bCs/>
                 <w:spacing w:val="-24"/>
-                <w:sz w:val="22"/>
-                <w:szCs w:val="22"/>
               </w:rPr>
               <w:t>02</w:t>
             </w:r>
             <w:r>
               <w:rPr>
-                <w:b w:val="1"/>
-                <w:bCs w:val="1"/>
+                <w:b/>
+                <w:bCs/>
                 <w:spacing w:val="-4"/>
-                <w:sz w:val="22"/>
-                <w:szCs w:val="22"/>
               </w:rPr>
               <w:t>/0</w:t>
             </w:r>
             <w:r>
               <w:rPr>
-                <w:b w:val="1"/>
-                <w:bCs w:val="1"/>
+                <w:b/>
+                <w:bCs/>
                 <w:spacing w:val="-4"/>
-                <w:sz w:val="22"/>
-                <w:szCs w:val="22"/>
               </w:rPr>
               <w:t>6</w:t>
             </w:r>
             <w:r>
               <w:rPr>
-                <w:b w:val="1"/>
-                <w:bCs w:val="1"/>
+                <w:b/>
+                <w:bCs/>
                 <w:spacing w:val="-4"/>
-                <w:sz w:val="22"/>
-                <w:szCs w:val="22"/>
               </w:rPr>
               <w:t>/202</w:t>
             </w:r>
             <w:r>
               <w:rPr>
-                <w:b w:val="1"/>
-                <w:bCs w:val="1"/>
+                <w:b/>
+                <w:bCs/>
                 <w:spacing w:val="-4"/>
-                <w:sz w:val="22"/>
-                <w:szCs w:val="22"/>
               </w:rPr>
               <w:t>5</w:t>
             </w:r>
@@ -328,137 +287,105 @@
         <w:tc>
           <w:tcPr>
             <w:tcW w:w="4542" w:type="dxa"/>
-            <w:tcMar/>
-          </w:tcPr>
-          <w:p wp14:textId="6E87D7D6">
+          </w:tcPr>
+          <w:p>
             <w:pPr>
               <w:pStyle w:val="TableParagraph"/>
               <w:spacing w:line="234" w:lineRule="exact"/>
               <w:ind w:left="114"/>
               <w:rPr>
-                <w:b w:val="1"/>
-                <w:bCs w:val="1"/>
-                <w:sz w:val="22"/>
-                <w:szCs w:val="22"/>
-              </w:rPr>
-            </w:pPr>
-            <w:r>
-              <w:rPr>
-                <w:b w:val="1"/>
-                <w:bCs w:val="1"/>
+                <w:b/>
+                <w:bCs/>
+              </w:rPr>
+            </w:pPr>
+            <w:r>
+              <w:rPr>
+                <w:b/>
+                <w:bCs/>
                 <w:spacing w:val="-6"/>
-                <w:sz w:val="22"/>
-                <w:szCs w:val="22"/>
               </w:rPr>
               <w:t>Final</w:t>
             </w:r>
             <w:r>
               <w:rPr>
-                <w:b w:val="1"/>
-                <w:bCs w:val="1"/>
+                <w:b/>
+                <w:bCs/>
                 <w:spacing w:val="-17"/>
-                <w:sz w:val="22"/>
-                <w:szCs w:val="22"/>
               </w:rPr>
               <w:t xml:space="preserve"> </w:t>
             </w:r>
             <w:r>
               <w:rPr>
-                <w:b w:val="1"/>
-                <w:bCs w:val="1"/>
+                <w:b/>
+                <w:bCs/>
                 <w:spacing w:val="-6"/>
-                <w:sz w:val="22"/>
-                <w:szCs w:val="22"/>
-              </w:rPr>
-              <w:t>Date</w:t>
-            </w:r>
-            <w:r>
-              <w:rPr>
-                <w:b w:val="1"/>
-                <w:bCs w:val="1"/>
+              </w:rPr>
+              <w:t>Date:</w:t>
+            </w:r>
+            <w:r>
+              <w:rPr>
+                <w:b/>
+                <w:bCs/>
+                <w:spacing w:val="-18"/>
+              </w:rPr>
+              <w:t xml:space="preserve"> </w:t>
+            </w:r>
+            <w:r>
+              <w:rPr>
+                <w:b/>
+                <w:bCs/>
+                <w:spacing w:val="-18"/>
+              </w:rPr>
+              <w:t>06</w:t>
+            </w:r>
+            <w:r>
+              <w:rPr>
+                <w:b/>
+                <w:bCs/>
                 <w:spacing w:val="-6"/>
-                <w:sz w:val="22"/>
-                <w:szCs w:val="22"/>
-              </w:rPr>
-              <w:t>:</w:t>
-            </w:r>
-            <w:r>
-              <w:rPr>
-                <w:b w:val="1"/>
-                <w:bCs w:val="1"/>
-                <w:spacing w:val="-18"/>
-                <w:sz w:val="22"/>
-                <w:szCs w:val="22"/>
-              </w:rPr>
-              <w:t xml:space="preserve"> </w:t>
-            </w:r>
-            <w:r>
-              <w:rPr>
-                <w:b w:val="1"/>
-                <w:bCs w:val="1"/>
-                <w:spacing w:val="-18"/>
-                <w:sz w:val="22"/>
-                <w:szCs w:val="22"/>
-              </w:rPr>
-              <w:t>06</w:t>
-            </w:r>
-            <w:r>
-              <w:rPr>
-                <w:b w:val="1"/>
-                <w:bCs w:val="1"/>
+              </w:rPr>
+              <w:t>/0</w:t>
+            </w:r>
+            <w:r>
+              <w:rPr>
+                <w:b/>
+                <w:bCs/>
                 <w:spacing w:val="-6"/>
-                <w:sz w:val="22"/>
-                <w:szCs w:val="22"/>
-              </w:rPr>
-              <w:t>/0</w:t>
-            </w:r>
-            <w:r>
-              <w:rPr>
-                <w:b w:val="1"/>
-                <w:bCs w:val="1"/>
+              </w:rPr>
+              <w:t>6</w:t>
+            </w:r>
+            <w:r>
+              <w:rPr>
+                <w:b/>
+                <w:bCs/>
                 <w:spacing w:val="-6"/>
-                <w:sz w:val="22"/>
-                <w:szCs w:val="22"/>
-              </w:rPr>
-              <w:t>6</w:t>
-            </w:r>
-            <w:r>
-              <w:rPr>
-                <w:b w:val="1"/>
-                <w:bCs w:val="1"/>
-                <w:spacing w:val="-6"/>
-                <w:sz w:val="22"/>
-                <w:szCs w:val="22"/>
               </w:rPr>
               <w:t>/2024</w:t>
             </w:r>
           </w:p>
         </w:tc>
       </w:tr>
-      <w:tr xmlns:wp14="http://schemas.microsoft.com/office/word/2010/wordml" wp14:textId="77777777">
+      <w:tr>
         <w:trPr>
-          <w:trHeight w:val="270" w:hRule="atLeast"/>
+          <w:trHeight w:val="270"/>
         </w:trPr>
         <w:tc>
           <w:tcPr>
             <w:tcW w:w="2831" w:type="dxa"/>
-            <w:tcMar/>
-          </w:tcPr>
-          <w:p wp14:textId="77777777">
+          </w:tcPr>
+          <w:p>
             <w:pPr>
               <w:pStyle w:val="TableParagraph"/>
               <w:spacing w:line="251" w:lineRule="exact"/>
               <w:ind w:left="110"/>
               <w:rPr>
                 <w:b/>
-                <w:sz w:val="22"/>
               </w:rPr>
             </w:pPr>
             <w:r>
               <w:rPr>
                 <w:b/>
                 <w:spacing w:val="-9"/>
-                <w:sz w:val="22"/>
               </w:rPr>
               <w:t>Project</w:t>
             </w:r>
@@ -466,15 +393,13 @@
               <w:rPr>
                 <w:b/>
                 <w:spacing w:val="-11"/>
-                <w:sz w:val="22"/>
-              </w:rPr>
-              <w:t> </w:t>
+              </w:rPr>
+              <w:t xml:space="preserve"> </w:t>
             </w:r>
             <w:r>
               <w:rPr>
                 <w:b/>
                 <w:spacing w:val="-2"/>
-                <w:sz w:val="22"/>
               </w:rPr>
               <w:t>Name:</w:t>
             </w:r>
@@ -484,67 +409,57 @@
           <w:tcPr>
             <w:tcW w:w="7375" w:type="dxa"/>
             <w:gridSpan w:val="2"/>
-            <w:tcMar/>
-          </w:tcPr>
-          <w:p wp14:textId="50540F49">
+          </w:tcPr>
+          <w:p>
             <w:pPr>
               <w:pStyle w:val="TableParagraph"/>
               <w:spacing w:line="251" w:lineRule="exact"/>
               <w:ind w:left="109"/>
               <w:rPr>
-                <w:b w:val="1"/>
-                <w:bCs w:val="1"/>
-                <w:sz w:val="22"/>
-                <w:szCs w:val="22"/>
-              </w:rPr>
-            </w:pPr>
-            <w:r>
-              <w:rPr>
-                <w:b w:val="1"/>
-                <w:bCs w:val="1"/>
+                <w:b/>
+                <w:bCs/>
+              </w:rPr>
+            </w:pPr>
+            <w:r>
+              <w:rPr>
+                <w:b/>
+                <w:bCs/>
                 <w:spacing w:val="-3"/>
-                <w:sz w:val="22"/>
-                <w:szCs w:val="22"/>
               </w:rPr>
               <w:t>SeniorCareManager-</w:t>
             </w:r>
             <w:r>
               <w:rPr>
-                <w:b w:val="1"/>
-                <w:bCs w:val="1"/>
+                <w:b/>
+                <w:bCs/>
                 <w:spacing w:val="-3"/>
-                <w:sz w:val="22"/>
-                <w:szCs w:val="22"/>
               </w:rPr>
               <w:t>Backend</w:t>
             </w:r>
           </w:p>
         </w:tc>
       </w:tr>
-      <w:tr xmlns:wp14="http://schemas.microsoft.com/office/word/2010/wordml" wp14:textId="77777777">
+      <w:tr>
         <w:trPr>
-          <w:trHeight w:val="261" w:hRule="atLeast"/>
+          <w:trHeight w:val="261"/>
         </w:trPr>
         <w:tc>
           <w:tcPr>
             <w:tcW w:w="2831" w:type="dxa"/>
-            <w:tcMar/>
-          </w:tcPr>
-          <w:p wp14:textId="77777777">
+          </w:tcPr>
+          <w:p>
             <w:pPr>
               <w:pStyle w:val="TableParagraph"/>
               <w:spacing w:line="241" w:lineRule="exact"/>
               <w:ind w:left="110"/>
               <w:rPr>
                 <w:b/>
-                <w:sz w:val="22"/>
               </w:rPr>
             </w:pPr>
             <w:r>
               <w:rPr>
                 <w:b/>
                 <w:spacing w:val="-8"/>
-                <w:sz w:val="22"/>
               </w:rPr>
               <w:t>Ano:</w:t>
             </w:r>
@@ -552,15 +467,13 @@
               <w:rPr>
                 <w:b/>
                 <w:spacing w:val="-20"/>
-                <w:sz w:val="22"/>
-              </w:rPr>
-              <w:t> </w:t>
+              </w:rPr>
+              <w:t xml:space="preserve"> </w:t>
             </w:r>
             <w:r>
               <w:rPr>
                 <w:b/>
                 <w:spacing w:val="-7"/>
-                <w:sz w:val="22"/>
               </w:rPr>
               <w:t>5º</w:t>
             </w:r>
@@ -570,23 +483,20 @@
           <w:tcPr>
             <w:tcW w:w="7375" w:type="dxa"/>
             <w:gridSpan w:val="2"/>
-            <w:tcMar/>
-          </w:tcPr>
-          <w:p wp14:textId="77777777">
+          </w:tcPr>
+          <w:p>
             <w:pPr>
               <w:pStyle w:val="TableParagraph"/>
               <w:spacing w:line="241" w:lineRule="exact"/>
               <w:ind w:left="109"/>
               <w:rPr>
                 <w:b/>
-                <w:sz w:val="22"/>
               </w:rPr>
             </w:pPr>
             <w:r>
               <w:rPr>
                 <w:b/>
                 <w:spacing w:val="-4"/>
-                <w:sz w:val="22"/>
               </w:rPr>
               <w:t>Análise</w:t>
             </w:r>
@@ -594,15 +504,13 @@
               <w:rPr>
                 <w:b/>
                 <w:spacing w:val="-15"/>
-                <w:sz w:val="22"/>
-              </w:rPr>
-              <w:t> </w:t>
+              </w:rPr>
+              <w:t xml:space="preserve"> </w:t>
             </w:r>
             <w:r>
               <w:rPr>
                 <w:b/>
                 <w:spacing w:val="-4"/>
-                <w:sz w:val="22"/>
               </w:rPr>
               <w:t>e</w:t>
             </w:r>
@@ -610,15 +518,13 @@
               <w:rPr>
                 <w:b/>
                 <w:spacing w:val="-8"/>
-                <w:sz w:val="22"/>
-              </w:rPr>
-              <w:t> </w:t>
+              </w:rPr>
+              <w:t xml:space="preserve"> </w:t>
             </w:r>
             <w:r>
               <w:rPr>
                 <w:b/>
                 <w:spacing w:val="-4"/>
-                <w:sz w:val="22"/>
               </w:rPr>
               <w:t>Desenvolvimento</w:t>
             </w:r>
@@ -626,15 +532,13 @@
               <w:rPr>
                 <w:b/>
                 <w:spacing w:val="-9"/>
-                <w:sz w:val="22"/>
-              </w:rPr>
-              <w:t> </w:t>
+              </w:rPr>
+              <w:t xml:space="preserve"> </w:t>
             </w:r>
             <w:r>
               <w:rPr>
                 <w:b/>
                 <w:spacing w:val="-4"/>
-                <w:sz w:val="22"/>
               </w:rPr>
               <w:t>de</w:t>
             </w:r>
@@ -642,15 +546,13 @@
               <w:rPr>
                 <w:b/>
                 <w:spacing w:val="-12"/>
-                <w:sz w:val="22"/>
-              </w:rPr>
-              <w:t> </w:t>
+              </w:rPr>
+              <w:t xml:space="preserve"> </w:t>
             </w:r>
             <w:r>
               <w:rPr>
                 <w:b/>
                 <w:spacing w:val="-4"/>
-                <w:sz w:val="22"/>
               </w:rPr>
               <w:t>Sistemas</w:t>
             </w:r>
@@ -658,15 +560,13 @@
               <w:rPr>
                 <w:b/>
                 <w:spacing w:val="5"/>
-                <w:sz w:val="22"/>
-              </w:rPr>
-              <w:t> </w:t>
+              </w:rPr>
+              <w:t xml:space="preserve"> </w:t>
             </w:r>
             <w:r>
               <w:rPr>
                 <w:b/>
                 <w:spacing w:val="-4"/>
-                <w:sz w:val="22"/>
               </w:rPr>
               <w:t>-</w:t>
             </w:r>
@@ -674,16 +574,15 @@
               <w:rPr>
                 <w:b/>
                 <w:spacing w:val="-5"/>
-                <w:sz w:val="22"/>
-              </w:rPr>
-              <w:t> AMS</w:t>
+              </w:rPr>
+              <w:t xml:space="preserve"> AMS</w:t>
             </w:r>
           </w:p>
         </w:tc>
       </w:tr>
-      <w:tr xmlns:wp14="http://schemas.microsoft.com/office/word/2010/wordml" wp14:textId="77777777">
+      <w:tr>
         <w:trPr>
-          <w:trHeight w:val="285" w:hRule="atLeast"/>
+          <w:trHeight w:val="285"/>
         </w:trPr>
         <w:tc>
           <w:tcPr>
@@ -694,9 +593,8 @@
               <w:bottom w:val="nil"/>
             </w:tcBorders>
             <w:shd w:val="clear" w:color="auto" w:fill="000000" w:themeFill="text1"/>
-            <w:tcMar/>
-          </w:tcPr>
-          <w:p wp14:textId="77777777">
+          </w:tcPr>
+          <w:p>
             <w:pPr>
               <w:pStyle w:val="TableParagraph"/>
               <w:spacing w:before="6" w:line="259" w:lineRule="exact"/>
@@ -704,7 +602,6 @@
               <w:jc w:val="center"/>
               <w:rPr>
                 <w:b/>
-                <w:sz w:val="22"/>
               </w:rPr>
             </w:pPr>
             <w:r>
@@ -712,7 +609,6 @@
                 <w:b/>
                 <w:color w:val="FFFFFF"/>
                 <w:spacing w:val="-11"/>
-                <w:sz w:val="22"/>
               </w:rPr>
               <w:t>Team</w:t>
             </w:r>
@@ -721,25 +617,23 @@
                 <w:b/>
                 <w:color w:val="FFFFFF"/>
                 <w:spacing w:val="-21"/>
-                <w:sz w:val="22"/>
-              </w:rPr>
-              <w:t> </w:t>
+              </w:rPr>
+              <w:t xml:space="preserve"> </w:t>
             </w:r>
             <w:r>
               <w:rPr>
                 <w:b/>
                 <w:color w:val="FFFFFF"/>
                 <w:spacing w:val="-2"/>
-                <w:sz w:val="22"/>
               </w:rPr>
               <w:t>Members</w:t>
             </w:r>
           </w:p>
         </w:tc>
       </w:tr>
-      <w:tr xmlns:wp14="http://schemas.microsoft.com/office/word/2010/wordml" wp14:textId="77777777">
+      <w:tr>
         <w:trPr>
-          <w:trHeight w:val="268" w:hRule="atLeast"/>
+          <w:trHeight w:val="268"/>
         </w:trPr>
         <w:tc>
           <w:tcPr>
@@ -748,143 +642,54 @@
             <w:tcBorders>
               <w:top w:val="nil"/>
             </w:tcBorders>
-            <w:tcMar/>
-          </w:tcPr>
-          <w:p wp14:textId="77777777">
+          </w:tcPr>
+          <w:p>
             <w:pPr>
               <w:pStyle w:val="TableParagraph"/>
               <w:spacing w:line="249" w:lineRule="exact"/>
               <w:ind w:left="110"/>
-              <w:rPr>
-                <w:sz w:val="22"/>
-              </w:rPr>
             </w:pPr>
             <w:r>
               <w:rPr>
                 <w:spacing w:val="-4"/>
-                <w:sz w:val="22"/>
               </w:rPr>
               <w:t>Edson</w:t>
             </w:r>
             <w:r>
               <w:rPr>
                 <w:spacing w:val="-19"/>
-                <w:sz w:val="22"/>
-              </w:rPr>
-              <w:t> </w:t>
+              </w:rPr>
+              <w:t xml:space="preserve"> </w:t>
             </w:r>
             <w:r>
               <w:rPr>
                 <w:spacing w:val="-4"/>
-                <w:sz w:val="22"/>
               </w:rPr>
               <w:t>Pereira</w:t>
             </w:r>
             <w:r>
               <w:rPr>
                 <w:spacing w:val="-17"/>
-                <w:sz w:val="22"/>
-              </w:rPr>
-              <w:t> </w:t>
+              </w:rPr>
+              <w:t xml:space="preserve"> </w:t>
             </w:r>
             <w:r>
               <w:rPr>
                 <w:spacing w:val="-4"/>
-                <w:sz w:val="22"/>
               </w:rPr>
               <w:t>De</w:t>
             </w:r>
             <w:r>
               <w:rPr>
                 <w:spacing w:val="-16"/>
-                <w:sz w:val="22"/>
-              </w:rPr>
-              <w:t> </w:t>
+              </w:rPr>
+              <w:t xml:space="preserve"> </w:t>
             </w:r>
             <w:r>
               <w:rPr>
                 <w:spacing w:val="-4"/>
-                <w:sz w:val="22"/>
               </w:rPr>
               <w:t>Carvalho</w:t>
-            </w:r>
-          </w:p>
-        </w:tc>
-      </w:tr>
-      <w:tr xmlns:wp14="http://schemas.microsoft.com/office/word/2010/wordml" wp14:textId="77777777">
-        <w:trPr>
-          <w:trHeight w:val="300"/>
-        </w:trPr>
-        <w:tc>
-          <w:tcPr>
-            <w:tcW w:w="10206" w:type="dxa"/>
-            <w:gridSpan w:val="3"/>
-            <w:tcMar/>
-          </w:tcPr>
-          <w:p wp14:textId="1FB85A64">
-            <w:pPr>
-              <w:pStyle w:val="TableParagraph"/>
-              <w:spacing w:line="251" w:lineRule="exact"/>
-              <w:ind w:left="110"/>
-              <w:rPr>
-                <w:sz w:val="22"/>
-                <w:szCs w:val="22"/>
-              </w:rPr>
-            </w:pPr>
-            <w:r>
-              <w:rPr>
-                <w:spacing w:val="-16"/>
-                <w:sz w:val="22"/>
-                <w:szCs w:val="22"/>
-              </w:rPr>
-              <w:t>Franciane</w:t>
-            </w:r>
-            <w:r>
-              <w:rPr>
-                <w:spacing w:val="-16"/>
-                <w:sz w:val="22"/>
-                <w:szCs w:val="22"/>
-              </w:rPr>
-              <w:t xml:space="preserve"> Ramos Franco</w:t>
-            </w:r>
-          </w:p>
-        </w:tc>
-      </w:tr>
-      <w:tr xmlns:wp14="http://schemas.microsoft.com/office/word/2010/wordml" wp14:textId="77777777">
-        <w:trPr>
-          <w:trHeight w:val="268" w:hRule="atLeast"/>
-        </w:trPr>
-        <w:tc>
-          <w:tcPr>
-            <w:tcW w:w="10206" w:type="dxa"/>
-            <w:gridSpan w:val="3"/>
-            <w:tcMar/>
-          </w:tcPr>
-          <w:p wp14:textId="41068C61">
-            <w:pPr>
-              <w:pStyle w:val="TableParagraph"/>
-              <w:spacing w:line="248" w:lineRule="exact"/>
-              <w:ind w:left="110"/>
-              <w:rPr>
-                <w:sz w:val="22"/>
-                <w:szCs w:val="22"/>
-              </w:rPr>
-            </w:pPr>
-            <w:r>
-              <w:rPr>
-                <w:spacing w:val="-4"/>
-                <w:sz w:val="22"/>
-                <w:szCs w:val="22"/>
-              </w:rPr>
-              <w:t>Mar</w:t>
-            </w:r>
-            <w:r>
-              <w:rPr>
-                <w:spacing w:val="-4"/>
-                <w:sz w:val="22"/>
-                <w:szCs w:val="22"/>
-              </w:rPr>
-              <w:t>co Antônio Dos Santos Masson</w:t>
             </w:r>
           </w:p>
         </w:tc>
@@ -897,149 +702,174 @@
           <w:tcPr>
             <w:tcW w:w="10206" w:type="dxa"/>
             <w:gridSpan w:val="3"/>
-            <w:tcMar/>
-          </w:tcPr>
-          <w:p>
-            <w:pPr>
-              <w:pStyle w:val="TableParagraph"/>
-              <w:spacing w:line="248" w:lineRule="exact"/>
-              <w:rPr>
-                <w:sz w:val="22"/>
-                <w:szCs w:val="22"/>
-              </w:rPr>
-            </w:pPr>
-            <w:r>
-              <w:rPr>
-                <w:sz w:val="22"/>
-                <w:szCs w:val="22"/>
-              </w:rPr>
-              <w:t xml:space="preserve">  Renato Dos Santos Filho</w:t>
+          </w:tcPr>
+          <w:p>
+            <w:pPr>
+              <w:pStyle w:val="TableParagraph"/>
+              <w:spacing w:line="251" w:lineRule="exact"/>
+              <w:ind w:left="110"/>
+            </w:pPr>
+            <w:r>
+              <w:rPr>
+                <w:spacing w:val="-16"/>
+              </w:rPr>
+              <w:t>Franciane Ramos Franco</w:t>
             </w:r>
           </w:p>
         </w:tc>
       </w:tr>
-      <w:tr xmlns:wp14="http://schemas.microsoft.com/office/word/2010/wordml" wp14:textId="77777777">
+      <w:tr>
         <w:trPr>
-          <w:trHeight w:val="266" w:hRule="atLeast"/>
+          <w:trHeight w:val="268"/>
         </w:trPr>
         <w:tc>
           <w:tcPr>
             <w:tcW w:w="10206" w:type="dxa"/>
             <w:gridSpan w:val="3"/>
-            <w:tcMar/>
-          </w:tcPr>
-          <w:p wp14:textId="77777777">
+          </w:tcPr>
+          <w:p>
+            <w:pPr>
+              <w:pStyle w:val="TableParagraph"/>
+              <w:spacing w:line="248" w:lineRule="exact"/>
+              <w:ind w:left="110"/>
+            </w:pPr>
+            <w:r>
+              <w:rPr>
+                <w:spacing w:val="-4"/>
+              </w:rPr>
+              <w:t>Mar</w:t>
+            </w:r>
+            <w:r>
+              <w:rPr>
+                <w:spacing w:val="-4"/>
+              </w:rPr>
+              <w:t>co Antônio Dos Santos Masson</w:t>
+            </w:r>
+          </w:p>
+        </w:tc>
+      </w:tr>
+      <w:tr>
+        <w:trPr>
+          <w:trHeight w:val="300"/>
+        </w:trPr>
+        <w:tc>
+          <w:tcPr>
+            <w:tcW w:w="10206" w:type="dxa"/>
+            <w:gridSpan w:val="3"/>
+          </w:tcPr>
+          <w:p>
+            <w:pPr>
+              <w:pStyle w:val="TableParagraph"/>
+              <w:spacing w:line="248" w:lineRule="exact"/>
+            </w:pPr>
+            <w:r>
+              <w:t xml:space="preserve">  Renato Dos Santos Filho</w:t>
+            </w:r>
+          </w:p>
+        </w:tc>
+      </w:tr>
+      <w:tr>
+        <w:trPr>
+          <w:trHeight w:val="266"/>
+        </w:trPr>
+        <w:tc>
+          <w:tcPr>
+            <w:tcW w:w="10206" w:type="dxa"/>
+            <w:gridSpan w:val="3"/>
+          </w:tcPr>
+          <w:p>
             <w:pPr>
               <w:pStyle w:val="TableParagraph"/>
               <w:spacing w:line="246" w:lineRule="exact"/>
               <w:ind w:left="110"/>
-              <w:rPr>
-                <w:sz w:val="22"/>
-              </w:rPr>
             </w:pPr>
             <w:r>
               <w:rPr>
                 <w:spacing w:val="-6"/>
-                <w:sz w:val="22"/>
               </w:rPr>
               <w:t>Rodrigo</w:t>
             </w:r>
             <w:r>
               <w:rPr>
                 <w:spacing w:val="-4"/>
-                <w:sz w:val="22"/>
-              </w:rPr>
-              <w:t> </w:t>
+              </w:rPr>
+              <w:t xml:space="preserve"> </w:t>
             </w:r>
             <w:r>
               <w:rPr>
                 <w:spacing w:val="-6"/>
-                <w:sz w:val="22"/>
               </w:rPr>
               <w:t>Yoshida</w:t>
             </w:r>
             <w:r>
               <w:rPr>
                 <w:spacing w:val="-5"/>
-                <w:sz w:val="22"/>
-              </w:rPr>
-              <w:t> </w:t>
+              </w:rPr>
+              <w:t xml:space="preserve"> </w:t>
             </w:r>
             <w:r>
               <w:rPr>
                 <w:spacing w:val="-6"/>
-                <w:sz w:val="22"/>
               </w:rPr>
               <w:t>Lombezzi</w:t>
             </w:r>
           </w:p>
         </w:tc>
       </w:tr>
-      <w:tr xmlns:wp14="http://schemas.microsoft.com/office/word/2010/wordml" wp14:textId="77777777">
+      <w:tr>
         <w:trPr>
-          <w:trHeight w:val="270" w:hRule="atLeast"/>
+          <w:trHeight w:val="270"/>
         </w:trPr>
         <w:tc>
           <w:tcPr>
             <w:tcW w:w="10206" w:type="dxa"/>
             <w:gridSpan w:val="3"/>
-            <w:tcMar/>
-          </w:tcPr>
-          <w:p wp14:textId="77777777">
+          </w:tcPr>
+          <w:p>
             <w:pPr>
               <w:pStyle w:val="TableParagraph"/>
               <w:spacing w:line="251" w:lineRule="exact"/>
               <w:ind w:left="110"/>
-              <w:rPr>
-                <w:sz w:val="22"/>
-              </w:rPr>
             </w:pPr>
             <w:r>
               <w:rPr>
                 <w:spacing w:val="-4"/>
-                <w:sz w:val="22"/>
               </w:rPr>
               <w:t>Vinicius</w:t>
             </w:r>
             <w:r>
               <w:rPr>
                 <w:spacing w:val="-5"/>
-                <w:sz w:val="22"/>
-              </w:rPr>
-              <w:t> </w:t>
+              </w:rPr>
+              <w:t xml:space="preserve"> </w:t>
             </w:r>
             <w:r>
               <w:rPr>
                 <w:spacing w:val="-4"/>
-                <w:sz w:val="22"/>
               </w:rPr>
               <w:t>Lúcio Marcolino</w:t>
             </w:r>
             <w:r>
               <w:rPr>
                 <w:spacing w:val="-6"/>
-                <w:sz w:val="22"/>
-              </w:rPr>
-              <w:t> </w:t>
+              </w:rPr>
+              <w:t xml:space="preserve"> </w:t>
             </w:r>
             <w:r>
               <w:rPr>
                 <w:spacing w:val="-4"/>
-                <w:sz w:val="22"/>
               </w:rPr>
               <w:t>Da</w:t>
             </w:r>
             <w:r>
               <w:rPr>
                 <w:spacing w:val="-10"/>
-                <w:sz w:val="22"/>
-              </w:rPr>
-              <w:t> </w:t>
+              </w:rPr>
+              <w:t xml:space="preserve"> </w:t>
             </w:r>
             <w:r>
               <w:rPr>
                 <w:spacing w:val="-4"/>
-                <w:sz w:val="22"/>
               </w:rPr>
               <w:t>Silva</w:t>
             </w:r>
@@ -1047,18 +877,18 @@
         </w:tc>
       </w:tr>
     </w:tbl>
-    <w:p xmlns:wp14="http://schemas.microsoft.com/office/word/2010/wordml" wp14:textId="77777777">
-      <w:pPr>
-        <w:pStyle w:val="BodyText"/>
+    <w:p>
+      <w:pPr>
+        <w:pStyle w:val="Corpodetexto"/>
         <w:rPr>
           <w:rFonts w:ascii="Times New Roman"/>
           <w:sz w:val="20"/>
         </w:rPr>
       </w:pPr>
     </w:p>
-    <w:p xmlns:wp14="http://schemas.microsoft.com/office/word/2010/wordml" wp14:textId="77777777">
-      <w:pPr>
-        <w:pStyle w:val="BodyText"/>
+    <w:p>
+      <w:pPr>
+        <w:pStyle w:val="Corpodetexto"/>
         <w:spacing w:before="10"/>
         <w:rPr>
           <w:rFonts w:ascii="Times New Roman"/>
@@ -1069,24 +899,21 @@
     <w:tbl>
       <w:tblPr>
         <w:tblW w:w="0" w:type="auto"/>
-        <w:jc w:val="left"/>
         <w:tblInd w:w="297" w:type="dxa"/>
         <w:tblBorders>
-          <w:top w:val="single" w:color="000000" w:sz="4" w:space="0"/>
-          <w:left w:val="single" w:color="000000" w:sz="4" w:space="0"/>
-          <w:bottom w:val="single" w:color="000000" w:sz="4" w:space="0"/>
-          <w:right w:val="single" w:color="000000" w:sz="4" w:space="0"/>
-          <w:insideH w:val="single" w:color="000000" w:sz="4" w:space="0"/>
-          <w:insideV w:val="single" w:color="000000" w:sz="4" w:space="0"/>
+          <w:top w:val="single" w:sz="4" w:space="0" w:color="000000"/>
+          <w:left w:val="single" w:sz="4" w:space="0" w:color="000000"/>
+          <w:bottom w:val="single" w:sz="4" w:space="0" w:color="000000"/>
+          <w:right w:val="single" w:sz="4" w:space="0" w:color="000000"/>
+          <w:insideH w:val="single" w:sz="4" w:space="0" w:color="000000"/>
+          <w:insideV w:val="single" w:sz="4" w:space="0" w:color="000000"/>
         </w:tblBorders>
         <w:tblLayout w:type="fixed"/>
         <w:tblCellMar>
-          <w:top w:w="0" w:type="dxa"/>
           <w:left w:w="0" w:type="dxa"/>
-          <w:bottom w:w="0" w:type="dxa"/>
           <w:right w:w="0" w:type="dxa"/>
         </w:tblCellMar>
-        <w:tblLook w:val="01E0"/>
+        <w:tblLook w:val="01E0" w:firstRow="1" w:lastRow="1" w:firstColumn="1" w:lastColumn="1" w:noHBand="0" w:noVBand="0"/>
       </w:tblPr>
       <w:tblGrid>
         <w:gridCol w:w="756"/>
@@ -1094,9 +921,9 @@
         <w:gridCol w:w="1541"/>
         <w:gridCol w:w="1671"/>
       </w:tblGrid>
-      <w:tr xmlns:wp14="http://schemas.microsoft.com/office/word/2010/wordml" wp14:textId="77777777">
+      <w:tr>
         <w:trPr>
-          <w:trHeight w:val="287" w:hRule="atLeast"/>
+          <w:trHeight w:val="287"/>
         </w:trPr>
         <w:tc>
           <w:tcPr>
@@ -1107,9 +934,8 @@
               <w:bottom w:val="nil"/>
             </w:tcBorders>
             <w:shd w:val="clear" w:color="auto" w:fill="000000" w:themeFill="text1"/>
-            <w:tcMar/>
-          </w:tcPr>
-          <w:p wp14:textId="77777777">
+          </w:tcPr>
+          <w:p>
             <w:pPr>
               <w:pStyle w:val="TableParagraph"/>
               <w:spacing w:before="4" w:line="264" w:lineRule="exact"/>
@@ -1117,7 +943,6 @@
               <w:jc w:val="center"/>
               <w:rPr>
                 <w:b/>
-                <w:sz w:val="22"/>
               </w:rPr>
             </w:pPr>
             <w:r>
@@ -1125,7 +950,6 @@
                 <w:b/>
                 <w:color w:val="FFFFFF"/>
                 <w:spacing w:val="-6"/>
-                <w:sz w:val="22"/>
               </w:rPr>
               <w:t>Sprint</w:t>
             </w:r>
@@ -1134,47 +958,40 @@
                 <w:b/>
                 <w:color w:val="FFFFFF"/>
                 <w:spacing w:val="-7"/>
-                <w:sz w:val="22"/>
-              </w:rPr>
-              <w:t> </w:t>
+              </w:rPr>
+              <w:t xml:space="preserve"> </w:t>
             </w:r>
             <w:r>
               <w:rPr>
                 <w:b/>
                 <w:color w:val="FFFFFF"/>
                 <w:spacing w:val="-2"/>
-                <w:sz w:val="22"/>
               </w:rPr>
               <w:t>Backlog</w:t>
             </w:r>
           </w:p>
         </w:tc>
       </w:tr>
-      <w:tr xmlns:wp14="http://schemas.microsoft.com/office/word/2010/wordml" wp14:textId="77777777">
+      <w:tr>
         <w:trPr>
-          <w:trHeight w:val="253" w:hRule="atLeast"/>
+          <w:trHeight w:val="253"/>
         </w:trPr>
         <w:tc>
           <w:tcPr>
             <w:tcW w:w="756" w:type="dxa"/>
             <w:tcBorders>
-              <w:bottom w:val="single" w:color="000000" w:themeColor="text1" w:sz="6" w:space="0"/>
+              <w:bottom w:val="single" w:sz="6" w:space="0" w:color="000000" w:themeColor="text1"/>
             </w:tcBorders>
-            <w:tcMar/>
-          </w:tcPr>
-          <w:p wp14:textId="77777777">
+          </w:tcPr>
+          <w:p>
             <w:pPr>
               <w:pStyle w:val="TableParagraph"/>
               <w:spacing w:line="234" w:lineRule="exact"/>
               <w:ind w:left="110"/>
-              <w:rPr>
-                <w:sz w:val="22"/>
-              </w:rPr>
             </w:pPr>
             <w:r>
               <w:rPr>
                 <w:spacing w:val="-2"/>
-                <w:sz w:val="22"/>
               </w:rPr>
               <w:t>Task#</w:t>
             </w:r>
@@ -1184,23 +1001,18 @@
           <w:tcPr>
             <w:tcW w:w="6239" w:type="dxa"/>
             <w:tcBorders>
-              <w:bottom w:val="single" w:color="000000" w:themeColor="text1" w:sz="6" w:space="0"/>
+              <w:bottom w:val="single" w:sz="6" w:space="0" w:color="000000" w:themeColor="text1"/>
             </w:tcBorders>
-            <w:tcMar/>
-          </w:tcPr>
-          <w:p wp14:textId="77777777">
+          </w:tcPr>
+          <w:p>
             <w:pPr>
               <w:pStyle w:val="TableParagraph"/>
               <w:spacing w:line="234" w:lineRule="exact"/>
               <w:ind w:left="108"/>
-              <w:rPr>
-                <w:sz w:val="22"/>
-              </w:rPr>
             </w:pPr>
             <w:r>
               <w:rPr>
                 <w:spacing w:val="-2"/>
-                <w:sz w:val="22"/>
               </w:rPr>
               <w:t>Description</w:t>
             </w:r>
@@ -1210,23 +1022,18 @@
           <w:tcPr>
             <w:tcW w:w="1541" w:type="dxa"/>
             <w:tcBorders>
-              <w:bottom w:val="single" w:color="000000" w:themeColor="text1" w:sz="6" w:space="0"/>
+              <w:bottom w:val="single" w:sz="6" w:space="0" w:color="000000" w:themeColor="text1"/>
             </w:tcBorders>
-            <w:tcMar/>
-          </w:tcPr>
-          <w:p wp14:textId="77777777">
+          </w:tcPr>
+          <w:p>
             <w:pPr>
               <w:pStyle w:val="TableParagraph"/>
               <w:spacing w:line="234" w:lineRule="exact"/>
               <w:ind w:left="108"/>
-              <w:rPr>
-                <w:sz w:val="22"/>
-              </w:rPr>
             </w:pPr>
             <w:r>
               <w:rPr>
                 <w:w w:val="90"/>
-                <w:sz w:val="22"/>
               </w:rPr>
               <w:t>Start</w:t>
             </w:r>
@@ -1234,14 +1041,12 @@
               <w:rPr>
                 <w:spacing w:val="-4"/>
                 <w:w w:val="90"/>
-                <w:sz w:val="22"/>
-              </w:rPr>
-              <w:t> </w:t>
+              </w:rPr>
+              <w:t xml:space="preserve"> </w:t>
             </w:r>
             <w:r>
               <w:rPr>
                 <w:spacing w:val="-4"/>
-                <w:sz w:val="22"/>
               </w:rPr>
               <w:t>Date</w:t>
             </w:r>
@@ -1251,64 +1056,50 @@
           <w:tcPr>
             <w:tcW w:w="1671" w:type="dxa"/>
             <w:tcBorders>
-              <w:bottom w:val="single" w:color="000000" w:themeColor="text1" w:sz="6" w:space="0"/>
+              <w:bottom w:val="single" w:sz="6" w:space="0" w:color="000000" w:themeColor="text1"/>
             </w:tcBorders>
-            <w:tcMar/>
-          </w:tcPr>
-          <w:p wp14:textId="77777777">
+          </w:tcPr>
+          <w:p>
             <w:pPr>
               <w:pStyle w:val="TableParagraph"/>
               <w:spacing w:line="234" w:lineRule="exact"/>
               <w:ind w:left="108"/>
-              <w:rPr>
-                <w:sz w:val="22"/>
-              </w:rPr>
             </w:pPr>
             <w:r>
               <w:rPr>
                 <w:spacing w:val="-2"/>
-                <w:sz w:val="22"/>
               </w:rPr>
               <w:t>Finaldate</w:t>
             </w:r>
           </w:p>
         </w:tc>
       </w:tr>
-      <w:tr xmlns:wp14="http://schemas.microsoft.com/office/word/2010/wordml" wp14:textId="77777777">
+      <w:tr>
         <w:trPr>
-          <w:trHeight w:val="767" w:hRule="atLeast"/>
+          <w:trHeight w:val="767"/>
         </w:trPr>
         <w:tc>
           <w:tcPr>
             <w:tcW w:w="756" w:type="dxa"/>
             <w:tcBorders>
-              <w:top w:val="single" w:color="000000" w:themeColor="text1" w:sz="6" w:space="0"/>
+              <w:top w:val="single" w:sz="6" w:space="0" w:color="000000" w:themeColor="text1"/>
             </w:tcBorders>
-            <w:tcMar/>
-          </w:tcPr>
-          <w:p wp14:textId="2489701F">
+          </w:tcPr>
+          <w:p>
             <w:pPr>
               <w:pStyle w:val="TableParagraph"/>
               <w:spacing w:before="239"/>
               <w:ind w:left="110"/>
-              <w:rPr>
-                <w:sz w:val="22"/>
-                <w:szCs w:val="22"/>
-              </w:rPr>
             </w:pPr>
             <w:r>
               <w:rPr>
                 <w:spacing w:val="-5"/>
-                <w:sz w:val="22"/>
-                <w:szCs w:val="22"/>
               </w:rPr>
               <w:t>7</w:t>
             </w:r>
             <w:r>
               <w:rPr>
                 <w:spacing w:val="-5"/>
-                <w:sz w:val="22"/>
-                <w:szCs w:val="22"/>
               </w:rPr>
               <w:t>7</w:t>
             </w:r>
@@ -1318,41 +1109,25 @@
           <w:tcPr>
             <w:tcW w:w="6239" w:type="dxa"/>
             <w:tcBorders>
-              <w:top w:val="single" w:color="000000" w:themeColor="text1" w:sz="6" w:space="0"/>
+              <w:top w:val="single" w:sz="6" w:space="0" w:color="000000" w:themeColor="text1"/>
             </w:tcBorders>
-            <w:tcMar/>
-          </w:tcPr>
-          <w:p wp14:textId="666CEA85">
-            <w:pPr>
-              <w:spacing w:before="240" w:beforeAutospacing="off" w:after="240" w:afterAutospacing="off" w:line="257" w:lineRule="auto"/>
-              <w:ind/>
-              <w:rPr>
-                <w:rFonts w:ascii="Aptos" w:hAnsi="Aptos" w:eastAsia="Aptos" w:cs="Aptos"/>
-                <w:noProof w:val="0"/>
-                <w:lang w:val="pt-PT"/>
-              </w:rPr>
-            </w:pPr>
-            <w:r>
-              <w:rPr>
-                <w:rFonts w:ascii="Aptos" w:hAnsi="Aptos" w:eastAsia="Aptos" w:cs="Aptos"/>
-                <w:noProof w:val="0"/>
-                <w:lang w:val="pt-PT"/>
-              </w:rPr>
-              <w:t xml:space="preserve">Implementar validações para a classe </w:t>
-            </w:r>
-            <w:r>
-              <w:rPr>
-                <w:rFonts w:ascii="Aptos" w:hAnsi="Aptos" w:eastAsia="Aptos" w:cs="Aptos"/>
-                <w:noProof w:val="0"/>
-                <w:lang w:val="pt-PT"/>
-              </w:rPr>
-              <w:t>Produ</w:t>
-            </w:r>
-            <w:r>
-              <w:rPr>
-                <w:rFonts w:ascii="Aptos" w:hAnsi="Aptos" w:eastAsia="Aptos" w:cs="Aptos"/>
-                <w:noProof w:val="0"/>
-                <w:lang w:val="pt-PT"/>
+          </w:tcPr>
+          <w:p>
+            <w:pPr>
+              <w:spacing w:before="240" w:after="240" w:line="257" w:lineRule="auto"/>
+              <w:rPr>
+                <w:rFonts w:ascii="Aptos" w:eastAsia="Aptos" w:hAnsi="Aptos" w:cs="Aptos"/>
+              </w:rPr>
+            </w:pPr>
+            <w:r>
+              <w:rPr>
+                <w:rFonts w:ascii="Aptos" w:eastAsia="Aptos" w:hAnsi="Aptos" w:cs="Aptos"/>
+              </w:rPr>
+              <w:t>Implementar validações para a classe Produ</w:t>
+            </w:r>
+            <w:r>
+              <w:rPr>
+                <w:rFonts w:ascii="Aptos" w:eastAsia="Aptos" w:hAnsi="Aptos" w:cs="Aptos"/>
               </w:rPr>
               <w:t>ctType</w:t>
             </w:r>
@@ -1362,41 +1137,30 @@
           <w:tcPr>
             <w:tcW w:w="1541" w:type="dxa"/>
             <w:tcBorders>
-              <w:top w:val="single" w:color="000000" w:themeColor="text1" w:sz="6" w:space="0"/>
+              <w:top w:val="single" w:sz="6" w:space="0" w:color="000000" w:themeColor="text1"/>
             </w:tcBorders>
-            <w:tcMar/>
-          </w:tcPr>
-          <w:p wp14:textId="6243CF20">
+          </w:tcPr>
+          <w:p>
             <w:pPr>
               <w:pStyle w:val="TableParagraph"/>
               <w:spacing w:line="268" w:lineRule="exact"/>
               <w:ind w:left="108"/>
-              <w:rPr>
-                <w:sz w:val="22"/>
-                <w:szCs w:val="22"/>
-              </w:rPr>
             </w:pPr>
             <w:r>
               <w:rPr>
                 <w:spacing w:val="-2"/>
-                <w:sz w:val="22"/>
-                <w:szCs w:val="22"/>
               </w:rPr>
               <w:t>02/06</w:t>
             </w:r>
             <w:r>
               <w:rPr>
                 <w:spacing w:val="-2"/>
-                <w:sz w:val="22"/>
-                <w:szCs w:val="22"/>
               </w:rPr>
               <w:t>/202</w:t>
             </w:r>
             <w:r>
               <w:rPr>
                 <w:spacing w:val="-2"/>
-                <w:sz w:val="22"/>
-                <w:szCs w:val="22"/>
               </w:rPr>
               <w:t>5</w:t>
             </w:r>
@@ -1406,57 +1170,42 @@
           <w:tcPr>
             <w:tcW w:w="1671" w:type="dxa"/>
             <w:tcBorders>
-              <w:top w:val="single" w:color="000000" w:themeColor="text1" w:sz="6" w:space="0"/>
+              <w:top w:val="single" w:sz="6" w:space="0" w:color="000000" w:themeColor="text1"/>
             </w:tcBorders>
-            <w:tcMar/>
-          </w:tcPr>
-          <w:p wp14:textId="6DCDB83B">
+          </w:tcPr>
+          <w:p>
             <w:pPr>
               <w:pStyle w:val="TableParagraph"/>
               <w:spacing w:line="268" w:lineRule="exact"/>
               <w:ind w:left="108"/>
-              <w:rPr>
-                <w:sz w:val="22"/>
-                <w:szCs w:val="22"/>
-              </w:rPr>
             </w:pPr>
             <w:r>
               <w:rPr>
                 <w:spacing w:val="-2"/>
-                <w:sz w:val="22"/>
-                <w:szCs w:val="22"/>
               </w:rPr>
               <w:t>06</w:t>
             </w:r>
             <w:r>
               <w:rPr>
                 <w:spacing w:val="-2"/>
-                <w:sz w:val="22"/>
-                <w:szCs w:val="22"/>
               </w:rPr>
               <w:t>/0</w:t>
             </w:r>
             <w:r>
               <w:rPr>
                 <w:spacing w:val="-2"/>
-                <w:sz w:val="22"/>
-                <w:szCs w:val="22"/>
               </w:rPr>
               <w:t>6</w:t>
             </w:r>
             <w:r>
               <w:rPr>
                 <w:spacing w:val="-2"/>
-                <w:sz w:val="22"/>
-                <w:szCs w:val="22"/>
               </w:rPr>
               <w:t>/202</w:t>
             </w:r>
             <w:r>
               <w:rPr>
                 <w:spacing w:val="-2"/>
-                <w:sz w:val="22"/>
-                <w:szCs w:val="22"/>
               </w:rPr>
               <w:t>5</w:t>
             </w:r>
@@ -1464,18 +1213,18 @@
         </w:tc>
       </w:tr>
     </w:tbl>
-    <w:p xmlns:wp14="http://schemas.microsoft.com/office/word/2010/wordml" wp14:textId="77777777">
-      <w:pPr>
-        <w:pStyle w:val="BodyText"/>
+    <w:p>
+      <w:pPr>
+        <w:pStyle w:val="Corpodetexto"/>
         <w:rPr>
           <w:rFonts w:ascii="Times New Roman"/>
           <w:sz w:val="20"/>
         </w:rPr>
       </w:pPr>
     </w:p>
-    <w:p xmlns:wp14="http://schemas.microsoft.com/office/word/2010/wordml" wp14:textId="77777777">
-      <w:pPr>
-        <w:pStyle w:val="BodyText"/>
+    <w:p>
+      <w:pPr>
+        <w:pStyle w:val="Corpodetexto"/>
         <w:spacing w:before="5"/>
         <w:rPr>
           <w:rFonts w:ascii="Times New Roman"/>
@@ -1486,24 +1235,21 @@
     <w:tbl>
       <w:tblPr>
         <w:tblW w:w="0" w:type="auto"/>
-        <w:jc w:val="left"/>
         <w:tblInd w:w="297" w:type="dxa"/>
         <w:tblBorders>
-          <w:top w:val="single" w:color="000000" w:sz="4" w:space="0"/>
-          <w:left w:val="single" w:color="000000" w:sz="4" w:space="0"/>
-          <w:bottom w:val="single" w:color="000000" w:sz="4" w:space="0"/>
-          <w:right w:val="single" w:color="000000" w:sz="4" w:space="0"/>
-          <w:insideH w:val="single" w:color="000000" w:sz="4" w:space="0"/>
-          <w:insideV w:val="single" w:color="000000" w:sz="4" w:space="0"/>
+          <w:top w:val="single" w:sz="4" w:space="0" w:color="000000"/>
+          <w:left w:val="single" w:sz="4" w:space="0" w:color="000000"/>
+          <w:bottom w:val="single" w:sz="4" w:space="0" w:color="000000"/>
+          <w:right w:val="single" w:sz="4" w:space="0" w:color="000000"/>
+          <w:insideH w:val="single" w:sz="4" w:space="0" w:color="000000"/>
+          <w:insideV w:val="single" w:sz="4" w:space="0" w:color="000000"/>
         </w:tblBorders>
         <w:tblLayout w:type="fixed"/>
         <w:tblCellMar>
-          <w:top w:w="0" w:type="dxa"/>
           <w:left w:w="0" w:type="dxa"/>
-          <w:bottom w:w="0" w:type="dxa"/>
           <w:right w:w="0" w:type="dxa"/>
         </w:tblCellMar>
-        <w:tblLook w:val="01E0"/>
+        <w:tblLook w:val="01E0" w:firstRow="1" w:lastRow="1" w:firstColumn="1" w:lastColumn="1" w:noHBand="0" w:noVBand="0"/>
       </w:tblPr>
       <w:tblGrid>
         <w:gridCol w:w="831"/>
@@ -1513,9 +1259,9 @@
         <w:gridCol w:w="1844"/>
         <w:gridCol w:w="1685"/>
       </w:tblGrid>
-      <w:tr xmlns:wp14="http://schemas.microsoft.com/office/word/2010/wordml" wp14:textId="77777777">
+      <w:tr>
         <w:trPr>
-          <w:trHeight w:val="290" w:hRule="atLeast"/>
+          <w:trHeight w:val="290"/>
         </w:trPr>
         <w:tc>
           <w:tcPr>
@@ -1526,9 +1272,8 @@
               <w:bottom w:val="nil"/>
             </w:tcBorders>
             <w:shd w:val="clear" w:color="auto" w:fill="000000" w:themeFill="text1"/>
-            <w:tcMar/>
-          </w:tcPr>
-          <w:p wp14:textId="77777777">
+          </w:tcPr>
+          <w:p>
             <w:pPr>
               <w:pStyle w:val="TableParagraph"/>
               <w:spacing w:before="4" w:line="266" w:lineRule="exact"/>
@@ -1536,7 +1281,6 @@
               <w:jc w:val="center"/>
               <w:rPr>
                 <w:b/>
-                <w:sz w:val="22"/>
               </w:rPr>
             </w:pPr>
             <w:r>
@@ -1544,7 +1288,6 @@
                 <w:b/>
                 <w:color w:val="FFFFFF"/>
                 <w:spacing w:val="-8"/>
-                <w:sz w:val="22"/>
               </w:rPr>
               <w:t>Task</w:t>
             </w:r>
@@ -1553,44 +1296,37 @@
                 <w:b/>
                 <w:color w:val="FFFFFF"/>
                 <w:spacing w:val="-12"/>
-                <w:sz w:val="22"/>
-              </w:rPr>
-              <w:t> </w:t>
+              </w:rPr>
+              <w:t xml:space="preserve"> </w:t>
             </w:r>
             <w:r>
               <w:rPr>
                 <w:b/>
                 <w:color w:val="FFFFFF"/>
                 <w:spacing w:val="-2"/>
-                <w:sz w:val="22"/>
               </w:rPr>
               <w:t>Description</w:t>
             </w:r>
           </w:p>
         </w:tc>
       </w:tr>
-      <w:tr xmlns:wp14="http://schemas.microsoft.com/office/word/2010/wordml" wp14:textId="77777777">
+      <w:tr>
         <w:trPr>
-          <w:trHeight w:val="256" w:hRule="atLeast"/>
+          <w:trHeight w:val="256"/>
         </w:trPr>
         <w:tc>
           <w:tcPr>
             <w:tcW w:w="831" w:type="dxa"/>
-            <w:tcMar/>
-          </w:tcPr>
-          <w:p wp14:textId="77777777">
+          </w:tcPr>
+          <w:p>
             <w:pPr>
               <w:pStyle w:val="TableParagraph"/>
               <w:spacing w:line="236" w:lineRule="exact"/>
               <w:ind w:left="110"/>
-              <w:rPr>
-                <w:sz w:val="22"/>
-              </w:rPr>
             </w:pPr>
             <w:r>
               <w:rPr>
                 <w:spacing w:val="-2"/>
-                <w:sz w:val="22"/>
               </w:rPr>
               <w:t>Task#</w:t>
             </w:r>
@@ -1599,21 +1335,16 @@
         <w:tc>
           <w:tcPr>
             <w:tcW w:w="2972" w:type="dxa"/>
-            <w:tcMar/>
-          </w:tcPr>
-          <w:p wp14:textId="77777777">
+          </w:tcPr>
+          <w:p>
             <w:pPr>
               <w:pStyle w:val="TableParagraph"/>
               <w:spacing w:line="236" w:lineRule="exact"/>
               <w:ind w:left="107"/>
-              <w:rPr>
-                <w:sz w:val="22"/>
-              </w:rPr>
             </w:pPr>
             <w:r>
               <w:rPr>
                 <w:spacing w:val="-2"/>
-                <w:sz w:val="22"/>
               </w:rPr>
               <w:t>Description</w:t>
             </w:r>
@@ -1622,35 +1353,28 @@
         <w:tc>
           <w:tcPr>
             <w:tcW w:w="1443" w:type="dxa"/>
-            <w:tcMar/>
-          </w:tcPr>
-          <w:p wp14:textId="77777777">
+          </w:tcPr>
+          <w:p>
             <w:pPr>
               <w:pStyle w:val="TableParagraph"/>
               <w:spacing w:line="236" w:lineRule="exact"/>
               <w:ind w:left="107"/>
-              <w:rPr>
-                <w:sz w:val="22"/>
-              </w:rPr>
             </w:pPr>
             <w:r>
               <w:rPr>
                 <w:spacing w:val="-2"/>
-                <w:sz w:val="22"/>
               </w:rPr>
               <w:t>Assigned</w:t>
             </w:r>
             <w:r>
               <w:rPr>
                 <w:spacing w:val="1"/>
-                <w:sz w:val="22"/>
-              </w:rPr>
-              <w:t> </w:t>
+              </w:rPr>
+              <w:t xml:space="preserve"> </w:t>
             </w:r>
             <w:r>
               <w:rPr>
                 <w:spacing w:val="-5"/>
-                <w:sz w:val="22"/>
               </w:rPr>
               <w:t>To</w:t>
             </w:r>
@@ -1659,21 +1383,16 @@
         <w:tc>
           <w:tcPr>
             <w:tcW w:w="1421" w:type="dxa"/>
-            <w:tcMar/>
-          </w:tcPr>
-          <w:p wp14:textId="77777777">
+          </w:tcPr>
+          <w:p>
             <w:pPr>
               <w:pStyle w:val="TableParagraph"/>
               <w:spacing w:line="236" w:lineRule="exact"/>
               <w:ind w:left="107"/>
-              <w:rPr>
-                <w:sz w:val="22"/>
-              </w:rPr>
             </w:pPr>
             <w:r>
               <w:rPr>
                 <w:spacing w:val="-2"/>
-                <w:sz w:val="22"/>
               </w:rPr>
               <w:t>Status</w:t>
             </w:r>
@@ -1682,35 +1401,28 @@
         <w:tc>
           <w:tcPr>
             <w:tcW w:w="1844" w:type="dxa"/>
-            <w:tcMar/>
-          </w:tcPr>
-          <w:p wp14:textId="77777777">
+          </w:tcPr>
+          <w:p>
             <w:pPr>
               <w:pStyle w:val="TableParagraph"/>
               <w:spacing w:line="236" w:lineRule="exact"/>
               <w:ind w:left="106"/>
-              <w:rPr>
-                <w:sz w:val="22"/>
-              </w:rPr>
             </w:pPr>
             <w:r>
               <w:rPr>
                 <w:spacing w:val="-6"/>
-                <w:sz w:val="22"/>
               </w:rPr>
               <w:t>Estimated</w:t>
             </w:r>
             <w:r>
               <w:rPr>
                 <w:spacing w:val="-4"/>
-                <w:sz w:val="22"/>
-              </w:rPr>
-              <w:t> </w:t>
+              </w:rPr>
+              <w:t xml:space="preserve"> </w:t>
             </w:r>
             <w:r>
               <w:rPr>
                 <w:spacing w:val="-2"/>
-                <w:sz w:val="22"/>
               </w:rPr>
               <w:t>Hours</w:t>
             </w:r>
@@ -1719,73 +1431,57 @@
         <w:tc>
           <w:tcPr>
             <w:tcW w:w="1685" w:type="dxa"/>
-            <w:tcMar/>
-          </w:tcPr>
-          <w:p wp14:textId="77777777">
+          </w:tcPr>
+          <w:p>
             <w:pPr>
               <w:pStyle w:val="TableParagraph"/>
               <w:spacing w:line="236" w:lineRule="exact"/>
               <w:ind w:left="104"/>
-              <w:rPr>
-                <w:sz w:val="22"/>
-              </w:rPr>
             </w:pPr>
             <w:r>
               <w:rPr>
                 <w:spacing w:val="-6"/>
-                <w:sz w:val="22"/>
               </w:rPr>
               <w:t>Logged</w:t>
             </w:r>
             <w:r>
               <w:rPr>
                 <w:spacing w:val="-9"/>
-                <w:sz w:val="22"/>
-              </w:rPr>
-              <w:t> </w:t>
+              </w:rPr>
+              <w:t xml:space="preserve"> </w:t>
             </w:r>
             <w:r>
               <w:rPr>
                 <w:spacing w:val="-2"/>
-                <w:sz w:val="22"/>
               </w:rPr>
               <w:t>Hours</w:t>
             </w:r>
           </w:p>
         </w:tc>
       </w:tr>
-      <w:tr xmlns:wp14="http://schemas.microsoft.com/office/word/2010/wordml" wp14:textId="77777777">
+      <w:tr>
         <w:trPr>
-          <w:trHeight w:val="1324" w:hRule="atLeast"/>
+          <w:trHeight w:val="1324"/>
         </w:trPr>
         <w:tc>
           <w:tcPr>
             <w:tcW w:w="831" w:type="dxa"/>
-            <w:tcMar/>
-          </w:tcPr>
-          <w:p wp14:textId="0EAE9B58">
+          </w:tcPr>
+          <w:p>
             <w:pPr>
               <w:pStyle w:val="TableParagraph"/>
               <w:spacing w:before="1"/>
               <w:ind w:left="110"/>
-              <w:rPr>
-                <w:sz w:val="22"/>
-                <w:szCs w:val="22"/>
-              </w:rPr>
             </w:pPr>
             <w:r>
               <w:rPr>
                 <w:spacing w:val="-5"/>
-                <w:sz w:val="22"/>
-                <w:szCs w:val="22"/>
               </w:rPr>
               <w:t>7</w:t>
             </w:r>
             <w:r>
               <w:rPr>
                 <w:spacing w:val="-5"/>
-                <w:sz w:val="22"/>
-                <w:szCs w:val="22"/>
               </w:rPr>
               <w:t>7</w:t>
             </w:r>
@@ -1794,39 +1490,23 @@
         <w:tc>
           <w:tcPr>
             <w:tcW w:w="2972" w:type="dxa"/>
-            <w:tcMar/>
-          </w:tcPr>
-          <w:p wp14:textId="7BDD809C">
-            <w:pPr>
-              <w:spacing w:before="240" w:beforeAutospacing="off" w:after="240" w:afterAutospacing="off" w:line="257" w:lineRule="auto"/>
-              <w:ind/>
-              <w:rPr>
-                <w:rFonts w:ascii="Aptos" w:hAnsi="Aptos" w:eastAsia="Aptos" w:cs="Aptos"/>
-                <w:noProof w:val="0"/>
-                <w:lang w:val="pt-PT"/>
-              </w:rPr>
-            </w:pPr>
-            <w:r>
-              <w:rPr>
-                <w:rFonts w:ascii="Aptos" w:hAnsi="Aptos" w:eastAsia="Aptos" w:cs="Aptos"/>
-                <w:noProof w:val="0"/>
-                <w:lang w:val="pt-PT"/>
-              </w:rPr>
-              <w:t xml:space="preserve">Implementar validações para a classe </w:t>
-            </w:r>
-            <w:r>
-              <w:rPr>
-                <w:rFonts w:ascii="Aptos" w:hAnsi="Aptos" w:eastAsia="Aptos" w:cs="Aptos"/>
-                <w:noProof w:val="0"/>
-                <w:lang w:val="pt-PT"/>
-              </w:rPr>
-              <w:t>Product</w:t>
-            </w:r>
-            <w:r>
-              <w:rPr>
-                <w:rFonts w:ascii="Aptos" w:hAnsi="Aptos" w:eastAsia="Aptos" w:cs="Aptos"/>
-                <w:noProof w:val="0"/>
-                <w:lang w:val="pt-PT"/>
+          </w:tcPr>
+          <w:p>
+            <w:pPr>
+              <w:spacing w:before="240" w:after="240" w:line="257" w:lineRule="auto"/>
+              <w:rPr>
+                <w:rFonts w:ascii="Aptos" w:eastAsia="Aptos" w:hAnsi="Aptos" w:cs="Aptos"/>
+              </w:rPr>
+            </w:pPr>
+            <w:r>
+              <w:rPr>
+                <w:rFonts w:ascii="Aptos" w:eastAsia="Aptos" w:hAnsi="Aptos" w:cs="Aptos"/>
+              </w:rPr>
+              <w:t>Implementar validações para a classe Product</w:t>
+            </w:r>
+            <w:r>
+              <w:rPr>
+                <w:rFonts w:ascii="Aptos" w:eastAsia="Aptos" w:hAnsi="Aptos" w:cs="Aptos"/>
               </w:rPr>
               <w:t>Type</w:t>
             </w:r>
@@ -1835,23 +1515,16 @@
         <w:tc>
           <w:tcPr>
             <w:tcW w:w="1443" w:type="dxa"/>
-            <w:tcMar/>
-          </w:tcPr>
-          <w:p wp14:textId="77777777">
+          </w:tcPr>
+          <w:p>
             <w:pPr>
               <w:pStyle w:val="TableParagraph"/>
               <w:spacing w:before="1" w:line="254" w:lineRule="auto"/>
               <w:ind w:left="107" w:right="145"/>
-              <w:rPr>
-                <w:sz w:val="22"/>
-                <w:szCs w:val="22"/>
-              </w:rPr>
             </w:pPr>
             <w:r>
               <w:rPr>
                 <w:spacing w:val="-4"/>
-                <w:sz w:val="22"/>
-                <w:szCs w:val="22"/>
               </w:rPr>
               <w:t>Vinicius</w:t>
             </w:r>
@@ -1860,21 +1533,16 @@
         <w:tc>
           <w:tcPr>
             <w:tcW w:w="1421" w:type="dxa"/>
-            <w:tcMar/>
-          </w:tcPr>
-          <w:p wp14:textId="77777777">
+          </w:tcPr>
+          <w:p>
             <w:pPr>
               <w:pStyle w:val="TableParagraph"/>
               <w:spacing w:before="1"/>
               <w:ind w:left="107"/>
-              <w:rPr>
-                <w:sz w:val="22"/>
-              </w:rPr>
             </w:pPr>
             <w:r>
               <w:rPr>
                 <w:spacing w:val="-2"/>
-                <w:sz w:val="22"/>
               </w:rPr>
               <w:t>Concluído</w:t>
             </w:r>
@@ -1883,58 +1551,44 @@
         <w:tc>
           <w:tcPr>
             <w:tcW w:w="1844" w:type="dxa"/>
-            <w:tcMar/>
-          </w:tcPr>
-          <w:p wp14:textId="77777777">
+          </w:tcPr>
+          <w:p>
             <w:pPr>
               <w:pStyle w:val="TableParagraph"/>
               <w:spacing w:before="1"/>
               <w:ind w:left="106"/>
-              <w:rPr>
-                <w:sz w:val="22"/>
-                <w:szCs w:val="22"/>
-              </w:rPr>
             </w:pPr>
             <w:r>
               <w:rPr>
                 <w:spacing w:val="-10"/>
-                <w:sz w:val="22"/>
-                <w:szCs w:val="22"/>
-              </w:rPr>
-              <w:t>4</w:t>
+              </w:rPr>
+              <w:t>8</w:t>
             </w:r>
           </w:p>
         </w:tc>
         <w:tc>
           <w:tcPr>
             <w:tcW w:w="1685" w:type="dxa"/>
-            <w:tcMar/>
-          </w:tcPr>
-          <w:p wp14:textId="77777777">
+          </w:tcPr>
+          <w:p>
             <w:pPr>
               <w:pStyle w:val="TableParagraph"/>
               <w:spacing w:before="1"/>
               <w:ind w:left="104"/>
-              <w:rPr>
-                <w:sz w:val="22"/>
-                <w:szCs w:val="22"/>
-              </w:rPr>
             </w:pPr>
             <w:r>
               <w:rPr>
                 <w:spacing w:val="-10"/>
-                <w:sz w:val="22"/>
-                <w:szCs w:val="22"/>
-              </w:rPr>
-              <w:t>4</w:t>
+              </w:rPr>
+              <w:t>8</w:t>
             </w:r>
           </w:p>
         </w:tc>
       </w:tr>
     </w:tbl>
-    <w:p xmlns:wp14="http://schemas.microsoft.com/office/word/2010/wordml" wp14:textId="77777777">
-      <w:pPr>
-        <w:pStyle w:val="BodyText"/>
+    <w:p>
+      <w:pPr>
+        <w:pStyle w:val="Corpodetexto"/>
         <w:spacing w:before="202"/>
         <w:rPr>
           <w:rFonts w:ascii="Times New Roman"/>
@@ -1942,12 +1596,12 @@
         </w:rPr>
       </w:pPr>
     </w:p>
-    <w:p xmlns:wp14="http://schemas.microsoft.com/office/word/2010/wordml" wp14:textId="77777777">
-      <w:pPr>
-        <w:pStyle w:val="Heading1"/>
+    <w:p>
+      <w:pPr>
+        <w:pStyle w:val="Ttulo1"/>
         <w:tabs>
-          <w:tab w:val="left" w:leader="none" w:pos="4392"/>
-          <w:tab w:val="left" w:leader="none" w:pos="10516"/>
+          <w:tab w:val="left" w:pos="4392"/>
+          <w:tab w:val="left" w:pos="10516"/>
         </w:tabs>
         <w:ind w:left="996" w:hanging="740"/>
       </w:pPr>
@@ -1979,7 +1633,7 @@
           <w:spacing w:val="-12"/>
           <w:highlight w:val="black"/>
         </w:rPr>
-        <w:t> </w:t>
+        <w:t xml:space="preserve"> </w:t>
       </w:r>
       <w:r>
         <w:rPr>
@@ -1997,9 +1651,9 @@
         <w:tab/>
       </w:r>
     </w:p>
-    <w:p xmlns:wp14="http://schemas.microsoft.com/office/word/2010/wordml" wp14:textId="77777777">
-      <w:pPr>
-        <w:pStyle w:val="BodyText"/>
+    <w:p>
+      <w:pPr>
+        <w:pStyle w:val="Corpodetexto"/>
         <w:spacing w:before="2"/>
         <w:rPr>
           <w:b/>
@@ -2009,34 +1663,30 @@
     </w:p>
     <w:p>
       <w:pPr>
-        <w:spacing w:before="240" w:beforeAutospacing="off" w:after="240" w:afterAutospacing="off" w:line="257" w:lineRule="auto"/>
-      </w:pPr>
-      <w:r>
-        <w:rPr>
-          <w:rFonts w:ascii="Aptos" w:hAnsi="Aptos" w:eastAsia="Aptos" w:cs="Aptos"/>
-          <w:noProof w:val="0"/>
-          <w:sz w:val="22"/>
-          <w:szCs w:val="22"/>
-          <w:lang w:val="pt-PT"/>
+        <w:spacing w:before="240" w:after="240" w:line="257" w:lineRule="auto"/>
+      </w:pPr>
+      <w:r>
+        <w:rPr>
+          <w:rFonts w:ascii="Aptos" w:eastAsia="Aptos" w:hAnsi="Aptos" w:cs="Aptos"/>
         </w:rPr>
         <w:t>Foram criadas validações para o campo 'Nome do Tipo do Produto'. Foi implementada uma verificação para impedir o cadastro quando o campo estiver vazio ou quando o nome já estiver registrado no banco de dados.</w:t>
       </w:r>
     </w:p>
-    <w:p xmlns:wp14="http://schemas.microsoft.com/office/word/2010/wordml" wp14:textId="77777777">
-      <w:pPr>
-        <w:pStyle w:val="BodyText"/>
+    <w:p>
+      <w:pPr>
+        <w:pStyle w:val="Corpodetexto"/>
         <w:spacing w:before="27"/>
         <w:rPr>
           <w:sz w:val="24"/>
         </w:rPr>
       </w:pPr>
     </w:p>
-    <w:p xmlns:wp14="http://schemas.microsoft.com/office/word/2010/wordml" wp14:textId="77777777">
-      <w:pPr>
-        <w:pStyle w:val="Heading1"/>
+    <w:p>
+      <w:pPr>
+        <w:pStyle w:val="Ttulo1"/>
         <w:tabs>
-          <w:tab w:val="left" w:leader="none" w:pos="4613"/>
-          <w:tab w:val="left" w:leader="none" w:pos="10487"/>
+          <w:tab w:val="left" w:pos="4613"/>
+          <w:tab w:val="left" w:pos="10487"/>
         </w:tabs>
         <w:ind w:left="285"/>
       </w:pPr>
@@ -2061,7 +1711,7 @@
           <w:spacing w:val="-12"/>
           <w:highlight w:val="black"/>
         </w:rPr>
-        <w:t> </w:t>
+        <w:t xml:space="preserve"> </w:t>
       </w:r>
       <w:r>
         <w:rPr>
@@ -2079,9 +1729,9 @@
         <w:tab/>
       </w:r>
     </w:p>
-    <w:p xmlns:wp14="http://schemas.microsoft.com/office/word/2010/wordml" wp14:textId="77777777">
-      <w:pPr>
-        <w:pStyle w:val="BodyText"/>
+    <w:p>
+      <w:pPr>
+        <w:pStyle w:val="Corpodetexto"/>
         <w:spacing w:before="198"/>
         <w:rPr>
           <w:b/>
@@ -2089,106 +1739,78 @@
         </w:rPr>
       </w:pPr>
     </w:p>
-    <w:p xmlns:wp14="http://schemas.microsoft.com/office/word/2010/wordml" wp14:textId="66511232">
-      <w:pPr>
-        <w:spacing w:before="240" w:beforeAutospacing="off" w:after="240" w:afterAutospacing="off" w:line="257" w:lineRule="auto"/>
-        <w:ind/>
-        <w:jc w:val="left"/>
-        <w:rPr>
-          <w:rFonts w:ascii="Aptos" w:hAnsi="Aptos" w:eastAsia="Aptos" w:cs="Aptos"/>
-          <w:noProof w:val="0"/>
-          <w:sz w:val="22"/>
-          <w:szCs w:val="22"/>
-          <w:lang w:val="pt-PT"/>
-        </w:rPr>
-      </w:pPr>
-      <w:r>
-        <w:rPr>
-          <w:b w:val="1"/>
-          <w:bCs w:val="1"/>
+    <w:p>
+      <w:pPr>
+        <w:spacing w:before="240" w:after="240" w:line="257" w:lineRule="auto"/>
+        <w:rPr>
+          <w:rFonts w:ascii="Aptos" w:eastAsia="Aptos" w:hAnsi="Aptos" w:cs="Aptos"/>
+        </w:rPr>
+      </w:pPr>
+      <w:r>
+        <w:rPr>
+          <w:b/>
+          <w:bCs/>
           <w:spacing w:val="-8"/>
-          <w:sz w:val="22"/>
-          <w:szCs w:val="22"/>
         </w:rPr>
         <w:t>Task</w:t>
       </w:r>
       <w:r>
         <w:rPr>
-          <w:b w:val="1"/>
-          <w:bCs w:val="1"/>
+          <w:b/>
+          <w:bCs/>
           <w:spacing w:val="-14"/>
-          <w:sz w:val="22"/>
-          <w:szCs w:val="22"/>
         </w:rPr>
         <w:t xml:space="preserve"> </w:t>
       </w:r>
       <w:r>
         <w:rPr>
-          <w:b w:val="1"/>
-          <w:bCs w:val="1"/>
+          <w:b/>
+          <w:bCs/>
           <w:spacing w:val="-4"/>
-          <w:sz w:val="22"/>
-          <w:szCs w:val="22"/>
         </w:rPr>
         <w:t>#</w:t>
       </w:r>
       <w:r>
         <w:rPr>
-          <w:b w:val="1"/>
-          <w:bCs w:val="1"/>
+          <w:b/>
+          <w:bCs/>
           <w:spacing w:val="-4"/>
-          <w:sz w:val="22"/>
-          <w:szCs w:val="22"/>
         </w:rPr>
         <w:t>7</w:t>
       </w:r>
       <w:r>
         <w:rPr>
-          <w:b w:val="1"/>
-          <w:bCs w:val="1"/>
+          <w:b/>
+          <w:bCs/>
           <w:spacing w:val="-4"/>
-          <w:sz w:val="22"/>
-          <w:szCs w:val="22"/>
         </w:rPr>
         <w:t>7</w:t>
       </w:r>
       <w:r>
         <w:rPr>
-          <w:b w:val="1"/>
-          <w:bCs w:val="1"/>
+          <w:b/>
+          <w:bCs/>
           <w:spacing w:val="-4"/>
-          <w:sz w:val="22"/>
-          <w:szCs w:val="22"/>
         </w:rPr>
         <w:t>:</w:t>
       </w:r>
       <w:r>
         <w:rPr>
-          <w:b w:val="1"/>
-          <w:bCs w:val="1"/>
+          <w:b/>
+          <w:bCs/>
           <w:spacing w:val="-4"/>
-          <w:sz w:val="22"/>
-          <w:szCs w:val="22"/>
         </w:rPr>
         <w:t xml:space="preserve"> </w:t>
       </w:r>
       <w:r>
         <w:rPr>
-          <w:rFonts w:ascii="Aptos" w:hAnsi="Aptos" w:eastAsia="Aptos" w:cs="Aptos"/>
-          <w:noProof w:val="0"/>
-          <w:sz w:val="22"/>
-          <w:szCs w:val="22"/>
-          <w:lang w:val="pt-PT"/>
+          <w:rFonts w:ascii="Aptos" w:eastAsia="Aptos" w:hAnsi="Aptos" w:cs="Aptos"/>
         </w:rPr>
         <w:t>Implementar validações para a classe Product</w:t>
       </w:r>
       <w:r>
         <w:rPr>
-          <w:rFonts w:ascii="Aptos" w:hAnsi="Aptos" w:eastAsia="Aptos" w:cs="Aptos"/>
-          <w:noProof w:val="0"/>
-          <w:sz w:val="22"/>
-          <w:szCs w:val="22"/>
-          <w:lang w:val="pt-PT"/>
+          <w:rFonts w:ascii="Aptos" w:eastAsia="Aptos" w:hAnsi="Aptos" w:cs="Aptos"/>
         </w:rPr>
         <w:t>Type</w:t>
       </w:r>
@@ -2200,16 +1822,12 @@
       </w:r>
       <w:r>
         <w:rPr>
-          <w:rFonts w:ascii="Aptos" w:hAnsi="Aptos" w:eastAsia="Aptos" w:cs="Aptos"/>
-          <w:noProof w:val="0"/>
-          <w:sz w:val="22"/>
-          <w:szCs w:val="22"/>
-          <w:lang w:val="pt-PT"/>
+          <w:rFonts w:ascii="Aptos" w:eastAsia="Aptos" w:hAnsi="Aptos" w:cs="Aptos"/>
         </w:rPr>
         <w:t>Diagrama De Classe: Classe que foi realizado as validações.</w:t>
       </w:r>
     </w:p>
-    <w:p xmlns:wp14="http://schemas.microsoft.com/office/word/2010/wordml" wp14:textId="2CDCA2AD">
+    <w:p>
       <w:pPr>
         <w:spacing w:before="9"/>
         <w:jc w:val="center"/>
@@ -2218,26 +1836,29 @@
         <w:br/>
       </w:r>
       <w:r>
+        <w:rPr>
+          <w:noProof/>
+        </w:rPr>
         <w:drawing>
-          <wp:inline xmlns:wp14="http://schemas.microsoft.com/office/word/2010/wordprocessingDrawing" wp14:editId="3B5A9333" wp14:anchorId="7A664091">
+          <wp:inline distT="0" distB="0" distL="0" distR="0" wp14:anchorId="7A664091" wp14:editId="3B5A9333">
             <wp:extent cx="1600338" cy="1082134"/>
             <wp:effectExtent l="0" t="0" r="0" b="0"/>
-            <wp:docPr id="1202522154" name="" title=""/>
+            <wp:docPr id="1202522154" name="Imagem 1202522154"/>
             <wp:cNvGraphicFramePr>
-              <a:graphicFrameLocks noChangeAspect="1"/>
+              <a:graphicFrameLocks xmlns:a="http://schemas.openxmlformats.org/drawingml/2006/main" noChangeAspect="1"/>
             </wp:cNvGraphicFramePr>
-            <a:graphic>
+            <a:graphic xmlns:a="http://schemas.openxmlformats.org/drawingml/2006/main">
               <a:graphicData uri="http://schemas.openxmlformats.org/drawingml/2006/picture">
-                <pic:pic>
+                <pic:pic xmlns:pic="http://schemas.openxmlformats.org/drawingml/2006/picture">
                   <pic:nvPicPr>
                     <pic:cNvPr id="0" name=""/>
                     <pic:cNvPicPr/>
                   </pic:nvPicPr>
                   <pic:blipFill>
-                    <a:blip r:embed="R727c58d9c3814fac">
+                    <a:blip r:embed="rId5">
                       <a:extLst>
-                        <a:ext xmlns:a="http://schemas.openxmlformats.org/drawingml/2006/main" uri="{28A0092B-C50C-407E-A947-70E740481C1C}">
-                          <a14:useLocalDpi val="0"/>
+                        <a:ext uri="{28A0092B-C50C-407E-A947-70E740481C1C}">
+                          <a14:useLocalDpi xmlns:a14="http://schemas.microsoft.com/office/drawing/2010/main" val="0"/>
                         </a:ext>
                       </a:extLst>
                     </a:blip>
@@ -2261,99 +1882,65 @@
         </w:drawing>
       </w:r>
     </w:p>
-    <w:p xmlns:wp14="http://schemas.microsoft.com/office/word/2010/wordml" wp14:textId="7627DC9C">
-      <w:pPr>
-        <w:spacing w:before="240" w:beforeAutospacing="off" w:after="240" w:afterAutospacing="off" w:line="257" w:lineRule="auto"/>
-        <w:jc w:val="left"/>
+    <w:p>
+      <w:pPr>
+        <w:spacing w:before="240" w:after="240" w:line="257" w:lineRule="auto"/>
       </w:pPr>
       <w:r>
         <w:br/>
       </w:r>
       <w:r>
-        <w:rPr>
-          <w:rFonts w:ascii="Calibri" w:hAnsi="Calibri" w:eastAsia="Calibri" w:cs="Calibri"/>
-          <w:noProof w:val="0"/>
-          <w:sz w:val="22"/>
-          <w:szCs w:val="22"/>
-          <w:lang w:val="pt-PT"/>
-        </w:rPr>
+        <w:lastRenderedPageBreak/>
         <w:t xml:space="preserve">Testes realizados: </w:t>
       </w:r>
       <w:r>
         <w:rPr>
-          <w:rFonts w:ascii="Aptos" w:hAnsi="Aptos" w:eastAsia="Aptos" w:cs="Aptos"/>
-          <w:noProof w:val="0"/>
-          <w:sz w:val="22"/>
-          <w:szCs w:val="22"/>
-          <w:lang w:val="pt-PT"/>
+          <w:rFonts w:ascii="Aptos" w:eastAsia="Aptos" w:hAnsi="Aptos" w:cs="Aptos"/>
         </w:rPr>
         <w:t xml:space="preserve">Foram criadas validações para verificar se os campos estão nulos e se o nome do </w:t>
       </w:r>
       <w:r>
         <w:rPr>
-          <w:rFonts w:ascii="Aptos" w:hAnsi="Aptos" w:eastAsia="Aptos" w:cs="Aptos"/>
-          <w:i w:val="1"/>
-          <w:iCs w:val="1"/>
-          <w:noProof w:val="0"/>
-          <w:sz w:val="22"/>
-          <w:szCs w:val="22"/>
-          <w:lang w:val="pt-PT"/>
+          <w:rFonts w:ascii="Aptos" w:eastAsia="Aptos" w:hAnsi="Aptos" w:cs="Aptos"/>
+          <w:i/>
+          <w:iCs/>
         </w:rPr>
         <w:t>ProductGroup</w:t>
       </w:r>
       <w:r>
         <w:rPr>
-          <w:rFonts w:ascii="Aptos" w:hAnsi="Aptos" w:eastAsia="Aptos" w:cs="Aptos"/>
-          <w:noProof w:val="0"/>
-          <w:sz w:val="22"/>
-          <w:szCs w:val="22"/>
-          <w:lang w:val="pt-PT"/>
+          <w:rFonts w:ascii="Aptos" w:eastAsia="Aptos" w:hAnsi="Aptos" w:cs="Aptos"/>
         </w:rPr>
         <w:t xml:space="preserve"> contém números. Essas validações, juntamente com as mensagens de retorno, foram implementadas em todos os métodos: POST, GET, PUT, DELETE e também nos que utilizam busca por ID.</w:t>
       </w:r>
     </w:p>
-    <w:p xmlns:wp14="http://schemas.microsoft.com/office/word/2010/wordml" wp14:textId="7052D0E7">
+    <w:p>
       <w:pPr>
         <w:spacing w:before="9"/>
-        <w:jc w:val="left"/>
-        <w:rPr>
-          <w:rFonts w:ascii="Calibri" w:hAnsi="Calibri" w:eastAsia="Calibri" w:cs="Calibri"/>
-          <w:noProof w:val="0"/>
-          <w:sz w:val="22"/>
-          <w:szCs w:val="22"/>
-          <w:lang w:val="pt-PT"/>
-        </w:rPr>
-      </w:pPr>
-    </w:p>
-    <w:p xmlns:wp14="http://schemas.microsoft.com/office/word/2010/wordml" wp14:textId="28BB5A2C">
-      <w:pPr>
-        <w:pStyle w:val="Normal"/>
+      </w:pPr>
+    </w:p>
+    <w:p>
+      <w:pPr>
         <w:spacing w:before="9"/>
         <w:jc w:val="center"/>
       </w:pPr>
     </w:p>
-    <w:p xmlns:wp14="http://schemas.microsoft.com/office/word/2010/wordml" wp14:textId="59FCC622">
-      <w:pPr>
-        <w:pStyle w:val="Normal"/>
+    <w:p>
+      <w:pPr>
         <w:spacing w:before="9"/>
-        <w:jc w:val="left"/>
-      </w:pPr>
-      <w:r>
-        <w:rPr/>
+      </w:pPr>
+      <w:r>
         <w:t xml:space="preserve">Teste com o nome </w:t>
       </w:r>
       <w:r>
-        <w:rPr/>
         <w:t>em branco</w:t>
       </w:r>
       <w:r>
-        <w:rPr/>
         <w:t>:</w:t>
       </w:r>
     </w:p>
-    <w:p xmlns:wp14="http://schemas.microsoft.com/office/word/2010/wordml" wp14:textId="74683465">
-      <w:pPr>
-        <w:pStyle w:val="Normal"/>
+    <w:p>
+      <w:pPr>
         <w:spacing w:before="9"/>
         <w:jc w:val="center"/>
       </w:pPr>
@@ -2361,26 +1948,29 @@
         <w:br/>
       </w:r>
       <w:r>
+        <w:rPr>
+          <w:noProof/>
+        </w:rPr>
         <w:drawing>
-          <wp:inline xmlns:wp14="http://schemas.microsoft.com/office/word/2010/wordprocessingDrawing" wp14:editId="05492150" wp14:anchorId="3F5EC48A">
+          <wp:inline distT="0" distB="0" distL="0" distR="0" wp14:anchorId="3F5EC48A" wp14:editId="05492150">
             <wp:extent cx="5020406" cy="1695687"/>
             <wp:effectExtent l="0" t="0" r="0" b="0"/>
-            <wp:docPr id="1393125875" name="" title=""/>
+            <wp:docPr id="1393125875" name="Imagem 1393125875"/>
             <wp:cNvGraphicFramePr>
-              <a:graphicFrameLocks noChangeAspect="1"/>
+              <a:graphicFrameLocks xmlns:a="http://schemas.openxmlformats.org/drawingml/2006/main" noChangeAspect="1"/>
             </wp:cNvGraphicFramePr>
-            <a:graphic>
+            <a:graphic xmlns:a="http://schemas.openxmlformats.org/drawingml/2006/main">
               <a:graphicData uri="http://schemas.openxmlformats.org/drawingml/2006/picture">
-                <pic:pic>
+                <pic:pic xmlns:pic="http://schemas.openxmlformats.org/drawingml/2006/picture">
                   <pic:nvPicPr>
                     <pic:cNvPr id="0" name=""/>
                     <pic:cNvPicPr/>
                   </pic:nvPicPr>
                   <pic:blipFill>
-                    <a:blip r:embed="R5af26aec735540e7">
+                    <a:blip r:embed="rId6">
                       <a:extLst>
-                        <a:ext xmlns:a="http://schemas.openxmlformats.org/drawingml/2006/main" uri="{28A0092B-C50C-407E-A947-70E740481C1C}">
-                          <a14:useLocalDpi val="0"/>
+                        <a:ext uri="{28A0092B-C50C-407E-A947-70E740481C1C}">
+                          <a14:useLocalDpi xmlns:a14="http://schemas.microsoft.com/office/drawing/2010/main" val="0"/>
                         </a:ext>
                       </a:extLst>
                     </a:blip>
@@ -2409,28 +1999,15 @@
     </w:p>
     <w:p>
       <w:pPr>
-        <w:pStyle w:val="Normal"/>
         <w:spacing w:before="9"/>
-        <w:jc w:val="left"/>
-      </w:pPr>
-      <w:r>
-        <w:rPr/>
-        <w:t xml:space="preserve">Teste cadastrando um campo que já foi </w:t>
-      </w:r>
-      <w:r>
-        <w:rPr/>
-        <w:t>registrado</w:t>
-      </w:r>
-      <w:r>
-        <w:rPr/>
-        <w:t>:</w:t>
-      </w:r>
-    </w:p>
-    <w:p>
-      <w:pPr>
-        <w:pStyle w:val="Normal"/>
+      </w:pPr>
+      <w:r>
+        <w:t>Teste cadastrando um campo que já foi registrado:</w:t>
+      </w:r>
+    </w:p>
+    <w:p>
+      <w:pPr>
         <w:spacing w:before="9"/>
-        <w:jc w:val="left"/>
       </w:pPr>
     </w:p>
     <w:p>
@@ -2439,26 +2016,29 @@
         <w:jc w:val="center"/>
       </w:pPr>
       <w:r>
+        <w:rPr>
+          <w:noProof/>
+        </w:rPr>
         <w:drawing>
-          <wp:inline wp14:editId="1F2D703C" wp14:anchorId="33E25D5C">
+          <wp:inline distT="0" distB="0" distL="0" distR="0" wp14:anchorId="33E25D5C" wp14:editId="1F2D703C">
             <wp:extent cx="5030038" cy="1610062"/>
             <wp:effectExtent l="0" t="0" r="0" b="0"/>
-            <wp:docPr id="962856240" name="" title=""/>
+            <wp:docPr id="962856240" name="Imagem 962856240"/>
             <wp:cNvGraphicFramePr>
-              <a:graphicFrameLocks noChangeAspect="1"/>
+              <a:graphicFrameLocks xmlns:a="http://schemas.openxmlformats.org/drawingml/2006/main" noChangeAspect="1"/>
             </wp:cNvGraphicFramePr>
-            <a:graphic>
+            <a:graphic xmlns:a="http://schemas.openxmlformats.org/drawingml/2006/main">
               <a:graphicData uri="http://schemas.openxmlformats.org/drawingml/2006/picture">
-                <pic:pic>
+                <pic:pic xmlns:pic="http://schemas.openxmlformats.org/drawingml/2006/picture">
                   <pic:nvPicPr>
                     <pic:cNvPr id="0" name=""/>
                     <pic:cNvPicPr/>
                   </pic:nvPicPr>
                   <pic:blipFill>
-                    <a:blip r:embed="R6f656c79a0cc4f50">
+                    <a:blip r:embed="rId7">
                       <a:extLst>
-                        <a:ext xmlns:a="http://schemas.openxmlformats.org/drawingml/2006/main" uri="{28A0092B-C50C-407E-A947-70E740481C1C}">
-                          <a14:useLocalDpi val="0"/>
+                        <a:ext uri="{28A0092B-C50C-407E-A947-70E740481C1C}">
+                          <a14:useLocalDpi xmlns:a14="http://schemas.microsoft.com/office/drawing/2010/main" val="0"/>
                         </a:ext>
                       </a:extLst>
                     </a:blip>
@@ -2491,60 +2071,57 @@
     <w:p>
       <w:pPr>
         <w:spacing w:before="9"/>
-        <w:jc w:val="left"/>
-      </w:pPr>
-      <w:r>
-        <w:rPr/>
+      </w:pPr>
+      <w:r>
         <w:t>Teste com o campo de grupo de produto em branco:</w:t>
       </w:r>
     </w:p>
     <w:p>
       <w:pPr>
         <w:spacing w:before="9"/>
-        <w:jc w:val="left"/>
-      </w:pPr>
-    </w:p>
-    <w:p xmlns:wp14="http://schemas.microsoft.com/office/word/2010/wordml" wp14:textId="77777777">
+      </w:pPr>
+    </w:p>
+    <w:p>
       <w:pPr>
         <w:pStyle w:val="TableParagraph"/>
-        <w:spacing w:after="0" w:line="271" w:lineRule="auto"/>
-        <w:rPr>
-          <w:sz w:val="22"/>
-        </w:rPr>
+        <w:spacing w:line="271" w:lineRule="auto"/>
         <w:sectPr>
           <w:type w:val="continuous"/>
-          <w:pgSz w:w="11920" w:h="16850" w:orient="portrait"/>
-          <w:pgMar w:top="720" w:right="425" w:bottom="280" w:left="708"/>
-          <w:cols w:num="1"/>
+          <w:pgSz w:w="11920" w:h="16850"/>
+          <w:pgMar w:top="720" w:right="425" w:bottom="280" w:left="708" w:header="720" w:footer="720" w:gutter="0"/>
+          <w:cols w:space="720"/>
         </w:sectPr>
       </w:pPr>
     </w:p>
-    <w:p xmlns:wp14="http://schemas.microsoft.com/office/word/2010/wordml" wp14:textId="6A1F442C">
+    <w:p>
       <w:pPr>
         <w:spacing w:before="176"/>
         <w:jc w:val="center"/>
       </w:pPr>
       <w:r>
+        <w:rPr>
+          <w:noProof/>
+        </w:rPr>
         <w:drawing>
-          <wp:inline xmlns:wp14="http://schemas.microsoft.com/office/word/2010/wordprocessingDrawing" wp14:editId="2C5837AA" wp14:anchorId="198009C9">
+          <wp:inline distT="0" distB="0" distL="0" distR="0" wp14:anchorId="198009C9" wp14:editId="2C5837AA">
             <wp:extent cx="5029202" cy="1562100"/>
             <wp:effectExtent l="0" t="0" r="0" b="0"/>
-            <wp:docPr id="1891180756" name="" title=""/>
+            <wp:docPr id="1891180756" name="Imagem 1891180756"/>
             <wp:cNvGraphicFramePr>
-              <a:graphicFrameLocks noChangeAspect="1"/>
+              <a:graphicFrameLocks xmlns:a="http://schemas.openxmlformats.org/drawingml/2006/main" noChangeAspect="1"/>
             </wp:cNvGraphicFramePr>
-            <a:graphic>
+            <a:graphic xmlns:a="http://schemas.openxmlformats.org/drawingml/2006/main">
               <a:graphicData uri="http://schemas.openxmlformats.org/drawingml/2006/picture">
-                <pic:pic>
+                <pic:pic xmlns:pic="http://schemas.openxmlformats.org/drawingml/2006/picture">
                   <pic:nvPicPr>
                     <pic:cNvPr id="0" name=""/>
                     <pic:cNvPicPr/>
                   </pic:nvPicPr>
                   <pic:blipFill>
-                    <a:blip r:embed="R4ad31371cb974c64">
+                    <a:blip r:embed="rId8">
                       <a:extLst>
-                        <a:ext xmlns:a="http://schemas.openxmlformats.org/drawingml/2006/main" uri="{28A0092B-C50C-407E-A947-70E740481C1C}">
-                          <a14:useLocalDpi val="0"/>
+                        <a:ext uri="{28A0092B-C50C-407E-A947-70E740481C1C}">
+                          <a14:useLocalDpi xmlns:a14="http://schemas.microsoft.com/office/drawing/2010/main" val="0"/>
                         </a:ext>
                       </a:extLst>
                     </a:blip>
@@ -2574,15 +2151,248 @@
         <w:br/>
       </w:r>
     </w:p>
-    <w:p xmlns:wp14="http://schemas.microsoft.com/office/word/2010/wordml" wp14:textId="77777777">
+    <w:p>
+      <w:pPr>
+        <w:spacing w:before="176"/>
+      </w:pPr>
+      <w:r>
+        <w:t>Teste com método POST:</w:t>
+      </w:r>
+      <w:r>
+        <w:br/>
+      </w:r>
+      <w:r>
+        <w:lastRenderedPageBreak/>
+        <w:drawing>
+          <wp:inline distT="0" distB="0" distL="0" distR="0" wp14:anchorId="01D49B22" wp14:editId="5450168E">
+            <wp:extent cx="6668431" cy="4963218"/>
+            <wp:effectExtent l="0" t="0" r="0" b="8890"/>
+            <wp:docPr id="1064966437" name="Imagem 1"/>
+            <wp:cNvGraphicFramePr>
+              <a:graphicFrameLocks xmlns:a="http://schemas.openxmlformats.org/drawingml/2006/main" noChangeAspect="1"/>
+            </wp:cNvGraphicFramePr>
+            <a:graphic xmlns:a="http://schemas.openxmlformats.org/drawingml/2006/main">
+              <a:graphicData uri="http://schemas.openxmlformats.org/drawingml/2006/picture">
+                <pic:pic xmlns:pic="http://schemas.openxmlformats.org/drawingml/2006/picture">
+                  <pic:nvPicPr>
+                    <pic:cNvPr id="1064966437" name=""/>
+                    <pic:cNvPicPr/>
+                  </pic:nvPicPr>
+                  <pic:blipFill>
+                    <a:blip r:embed="rId9"/>
+                    <a:stretch>
+                      <a:fillRect/>
+                    </a:stretch>
+                  </pic:blipFill>
+                  <pic:spPr>
+                    <a:xfrm>
+                      <a:off x="0" y="0"/>
+                      <a:ext cx="6668431" cy="4963218"/>
+                    </a:xfrm>
+                    <a:prstGeom prst="rect">
+                      <a:avLst/>
+                    </a:prstGeom>
+                  </pic:spPr>
+                </pic:pic>
+              </a:graphicData>
+            </a:graphic>
+          </wp:inline>
+        </w:drawing>
+      </w:r>
+    </w:p>
+    <w:p>
+      <w:pPr>
+        <w:spacing w:before="176"/>
+        <w:jc w:val="center"/>
+      </w:pPr>
+    </w:p>
+    <w:p>
+      <w:pPr>
+        <w:spacing w:before="176"/>
+      </w:pPr>
+      <w:r>
+        <w:t>Teste com GET por ID:</w:t>
+      </w:r>
+    </w:p>
+    <w:p>
+      <w:pPr>
+        <w:spacing w:before="176"/>
+        <w:jc w:val="center"/>
+      </w:pPr>
+      <w:r>
+        <w:br/>
+      </w:r>
+      <w:r>
+        <w:drawing>
+          <wp:inline distT="0" distB="0" distL="0" distR="0" wp14:anchorId="1E959548" wp14:editId="6B8CABD1">
+            <wp:extent cx="6582694" cy="4124901"/>
+            <wp:effectExtent l="0" t="0" r="8890" b="9525"/>
+            <wp:docPr id="855358511" name="Imagem 1"/>
+            <wp:cNvGraphicFramePr>
+              <a:graphicFrameLocks xmlns:a="http://schemas.openxmlformats.org/drawingml/2006/main" noChangeAspect="1"/>
+            </wp:cNvGraphicFramePr>
+            <a:graphic xmlns:a="http://schemas.openxmlformats.org/drawingml/2006/main">
+              <a:graphicData uri="http://schemas.openxmlformats.org/drawingml/2006/picture">
+                <pic:pic xmlns:pic="http://schemas.openxmlformats.org/drawingml/2006/picture">
+                  <pic:nvPicPr>
+                    <pic:cNvPr id="855358511" name=""/>
+                    <pic:cNvPicPr/>
+                  </pic:nvPicPr>
+                  <pic:blipFill>
+                    <a:blip r:embed="rId10"/>
+                    <a:stretch>
+                      <a:fillRect/>
+                    </a:stretch>
+                  </pic:blipFill>
+                  <pic:spPr>
+                    <a:xfrm>
+                      <a:off x="0" y="0"/>
+                      <a:ext cx="6582694" cy="4124901"/>
+                    </a:xfrm>
+                    <a:prstGeom prst="rect">
+                      <a:avLst/>
+                    </a:prstGeom>
+                  </pic:spPr>
+                </pic:pic>
+              </a:graphicData>
+            </a:graphic>
+          </wp:inline>
+        </w:drawing>
+      </w:r>
+    </w:p>
+    <w:p>
+      <w:pPr>
+        <w:spacing w:before="176"/>
+      </w:pPr>
+      <w:r>
+        <w:lastRenderedPageBreak/>
+        <w:t>Teste PUT:</w:t>
+      </w:r>
+      <w:r>
+        <w:br/>
+      </w:r>
+    </w:p>
+    <w:p>
+      <w:pPr>
+        <w:spacing w:before="176"/>
+        <w:jc w:val="center"/>
+      </w:pPr>
+      <w:r>
+        <w:br/>
+      </w:r>
+      <w:r>
+        <w:drawing>
+          <wp:inline distT="0" distB="0" distL="0" distR="0" wp14:anchorId="361AC3F4" wp14:editId="3BDC44DA">
+            <wp:extent cx="4315427" cy="4982270"/>
+            <wp:effectExtent l="0" t="0" r="9525" b="8890"/>
+            <wp:docPr id="1014684189" name="Imagem 1"/>
+            <wp:cNvGraphicFramePr>
+              <a:graphicFrameLocks xmlns:a="http://schemas.openxmlformats.org/drawingml/2006/main" noChangeAspect="1"/>
+            </wp:cNvGraphicFramePr>
+            <a:graphic xmlns:a="http://schemas.openxmlformats.org/drawingml/2006/main">
+              <a:graphicData uri="http://schemas.openxmlformats.org/drawingml/2006/picture">
+                <pic:pic xmlns:pic="http://schemas.openxmlformats.org/drawingml/2006/picture">
+                  <pic:nvPicPr>
+                    <pic:cNvPr id="1014684189" name=""/>
+                    <pic:cNvPicPr/>
+                  </pic:nvPicPr>
+                  <pic:blipFill>
+                    <a:blip r:embed="rId11"/>
+                    <a:stretch>
+                      <a:fillRect/>
+                    </a:stretch>
+                  </pic:blipFill>
+                  <pic:spPr>
+                    <a:xfrm>
+                      <a:off x="0" y="0"/>
+                      <a:ext cx="4315427" cy="4982270"/>
+                    </a:xfrm>
+                    <a:prstGeom prst="rect">
+                      <a:avLst/>
+                    </a:prstGeom>
+                  </pic:spPr>
+                </pic:pic>
+              </a:graphicData>
+            </a:graphic>
+          </wp:inline>
+        </w:drawing>
+      </w:r>
+    </w:p>
+    <w:p>
+      <w:pPr>
+        <w:spacing w:before="176"/>
+        <w:jc w:val="center"/>
+      </w:pPr>
+    </w:p>
+    <w:p>
+      <w:pPr>
+        <w:spacing w:before="176"/>
+      </w:pPr>
+      <w:r>
+        <w:t>Teste DELETE:</w:t>
+      </w:r>
+      <w:r>
+        <w:br/>
+      </w:r>
+    </w:p>
+    <w:p>
+      <w:pPr>
+        <w:spacing w:before="176"/>
+        <w:jc w:val="center"/>
+      </w:pPr>
+      <w:r>
+        <w:br/>
+      </w:r>
+      <w:r>
+        <w:lastRenderedPageBreak/>
+        <w:drawing>
+          <wp:inline distT="0" distB="0" distL="0" distR="0" wp14:anchorId="18E803A3" wp14:editId="17E03957">
+            <wp:extent cx="5477639" cy="3648584"/>
+            <wp:effectExtent l="0" t="0" r="8890" b="9525"/>
+            <wp:docPr id="1914236935" name="Imagem 1"/>
+            <wp:cNvGraphicFramePr>
+              <a:graphicFrameLocks xmlns:a="http://schemas.openxmlformats.org/drawingml/2006/main" noChangeAspect="1"/>
+            </wp:cNvGraphicFramePr>
+            <a:graphic xmlns:a="http://schemas.openxmlformats.org/drawingml/2006/main">
+              <a:graphicData uri="http://schemas.openxmlformats.org/drawingml/2006/picture">
+                <pic:pic xmlns:pic="http://schemas.openxmlformats.org/drawingml/2006/picture">
+                  <pic:nvPicPr>
+                    <pic:cNvPr id="1914236935" name=""/>
+                    <pic:cNvPicPr/>
+                  </pic:nvPicPr>
+                  <pic:blipFill>
+                    <a:blip r:embed="rId12"/>
+                    <a:stretch>
+                      <a:fillRect/>
+                    </a:stretch>
+                  </pic:blipFill>
+                  <pic:spPr>
+                    <a:xfrm>
+                      <a:off x="0" y="0"/>
+                      <a:ext cx="5477639" cy="3648584"/>
+                    </a:xfrm>
+                    <a:prstGeom prst="rect">
+                      <a:avLst/>
+                    </a:prstGeom>
+                  </pic:spPr>
+                </pic:pic>
+              </a:graphicData>
+            </a:graphic>
+          </wp:inline>
+        </w:drawing>
+      </w:r>
+      <w:r>
+        <w:br/>
+      </w:r>
+    </w:p>
+    <w:p>
       <w:pPr>
         <w:tabs>
-          <w:tab w:val="left" w:leader="none" w:pos="4810"/>
-          <w:tab w:val="left" w:leader="none" w:pos="10665"/>
+          <w:tab w:val="left" w:pos="4810"/>
+          <w:tab w:val="left" w:pos="10665"/>
         </w:tabs>
         <w:spacing w:before="1"/>
-        <w:ind w:left="112" w:right="0" w:firstLine="0"/>
-        <w:jc w:val="left"/>
+        <w:ind w:left="112"/>
         <w:rPr>
           <w:b/>
           <w:sz w:val="24"/>
@@ -2599,8 +2409,8 @@
       </w:r>
       <w:r>
         <w:rPr>
-          <w:b w:val="1"/>
-          <w:bCs w:val="1"/>
+          <w:b/>
+          <w:bCs/>
           <w:color w:val="FFFFFF"/>
           <w:spacing w:val="-2"/>
           <w:sz w:val="24"/>
@@ -2621,23 +2431,23 @@
     </w:p>
     <w:p>
       <w:pPr>
-        <w:pStyle w:val="BodyText"/>
+        <w:pStyle w:val="Corpodetexto"/>
         <w:spacing w:before="196"/>
         <w:rPr>
-          <w:b w:val="1"/>
-          <w:bCs w:val="1"/>
+          <w:b/>
+          <w:bCs/>
           <w:sz w:val="20"/>
           <w:szCs w:val="20"/>
         </w:rPr>
       </w:pPr>
     </w:p>
-    <w:p xmlns:wp14="http://schemas.microsoft.com/office/word/2010/wordml" wp14:textId="36C9C504">
-      <w:pPr>
-        <w:pStyle w:val="BodyText"/>
+    <w:p>
+      <w:pPr>
+        <w:pStyle w:val="Corpodetexto"/>
         <w:spacing w:before="196"/>
         <w:rPr>
-          <w:b w:val="1"/>
-          <w:bCs w:val="1"/>
+          <w:b/>
+          <w:bCs/>
           <w:sz w:val="20"/>
           <w:szCs w:val="20"/>
         </w:rPr>
@@ -2649,9 +2459,9 @@
         <w:br/>
       </w:r>
     </w:p>
-    <w:p xmlns:wp14="http://schemas.microsoft.com/office/word/2010/wordml" wp14:textId="77777777">
-      <w:pPr>
-        <w:pStyle w:val="BodyText"/>
+    <w:p>
+      <w:pPr>
+        <w:pStyle w:val="Corpodetexto"/>
         <w:spacing w:before="26"/>
         <w:rPr>
           <w:b/>
@@ -2662,21 +2472,10 @@
     <w:tbl>
       <w:tblPr>
         <w:tblW w:w="0" w:type="auto"/>
-        <w:jc w:val="left"/>
         <w:tblInd w:w="526" w:type="dxa"/>
-        <w:tblBorders>
-          <w:top w:val="none" w:color="auto" w:sz="0" w:space="0"/>
-          <w:left w:val="none" w:color="auto" w:sz="0" w:space="0"/>
-          <w:bottom w:val="none" w:color="auto" w:sz="0" w:space="0"/>
-          <w:right w:val="none" w:color="auto" w:sz="0" w:space="0"/>
-          <w:insideH w:val="none" w:color="auto" w:sz="0" w:space="0"/>
-          <w:insideV w:val="none" w:color="auto" w:sz="0" w:space="0"/>
-        </w:tblBorders>
         <w:tblLayout w:type="fixed"/>
         <w:tblCellMar>
-          <w:top w:w="0" w:type="dxa"/>
           <w:left w:w="0" w:type="dxa"/>
-          <w:bottom w:w="0" w:type="dxa"/>
           <w:right w:w="0" w:type="dxa"/>
         </w:tblCellMar>
         <w:tblLook w:val="01A0" w:firstRow="1" w:lastRow="0" w:firstColumn="1" w:lastColumn="1" w:noHBand="0" w:noVBand="0"/>
@@ -2685,16 +2484,15 @@
         <w:gridCol w:w="4692"/>
         <w:gridCol w:w="3713"/>
       </w:tblGrid>
-      <w:tr xmlns:wp14="http://schemas.microsoft.com/office/word/2010/wordml" wp14:textId="77777777">
+      <w:tr>
         <w:trPr>
           <w:trHeight w:val="300"/>
         </w:trPr>
         <w:tc>
           <w:tcPr>
             <w:tcW w:w="4692" w:type="dxa"/>
-            <w:tcMar/>
-          </w:tcPr>
-          <w:p wp14:textId="32EF6EF2">
+          </w:tcPr>
+          <w:p>
             <w:pPr>
               <w:pStyle w:val="TableParagraph"/>
               <w:spacing w:line="231" w:lineRule="exact"/>
@@ -2713,7 +2511,25 @@
                 <w:sz w:val="20"/>
                 <w:szCs w:val="20"/>
               </w:rPr>
-              <w:t>Vinicius Lúcio Marcolino Da Silva</w:t>
+              <w:t>Vinicius L</w:t>
+            </w:r>
+            <w:r>
+              <w:rPr>
+                <w:rFonts w:ascii="Trebuchet MS"/>
+                <w:spacing w:val="-2"/>
+                <w:sz w:val="20"/>
+                <w:szCs w:val="20"/>
+              </w:rPr>
+              <w:t>ú</w:t>
+            </w:r>
+            <w:r>
+              <w:rPr>
+                <w:rFonts w:ascii="Trebuchet MS"/>
+                <w:spacing w:val="-2"/>
+                <w:sz w:val="20"/>
+                <w:szCs w:val="20"/>
+              </w:rPr>
+              <w:t>cio Marcolino Da Silva</w:t>
             </w:r>
             <w:r>
               <w:br/>
@@ -2735,9 +2551,8 @@
         <w:tc>
           <w:tcPr>
             <w:tcW w:w="3713" w:type="dxa"/>
-            <w:tcMar/>
-          </w:tcPr>
-          <w:p wp14:textId="77777777">
+          </w:tcPr>
+          <w:p>
             <w:pPr>
               <w:pStyle w:val="TableParagraph"/>
               <w:spacing w:line="231" w:lineRule="exact"/>
@@ -2751,16 +2566,15 @@
           </w:p>
         </w:tc>
       </w:tr>
-      <w:tr xmlns:wp14="http://schemas.microsoft.com/office/word/2010/wordml" wp14:textId="77777777">
+      <w:tr>
         <w:trPr>
           <w:trHeight w:val="300"/>
         </w:trPr>
         <w:tc>
           <w:tcPr>
             <w:tcW w:w="4692" w:type="dxa"/>
-            <w:tcMar/>
-          </w:tcPr>
-          <w:p wp14:textId="77777777">
+          </w:tcPr>
+          <w:p>
             <w:pPr>
               <w:pStyle w:val="TableParagraph"/>
               <w:rPr>
@@ -2769,12 +2583,11 @@
               </w:rPr>
             </w:pPr>
           </w:p>
-          <w:p wp14:textId="527652E2">
+          <w:p>
             <w:pPr>
               <w:pStyle w:val="TableParagraph"/>
               <w:spacing w:line="224" w:lineRule="exact"/>
               <w:ind w:right="580"/>
-              <w:jc w:val="left"/>
               <w:rPr>
                 <w:rFonts w:ascii="Trebuchet MS"/>
                 <w:sz w:val="20"/>
@@ -2889,9 +2702,8 @@
         <w:tc>
           <w:tcPr>
             <w:tcW w:w="3713" w:type="dxa"/>
-            <w:tcMar/>
-          </w:tcPr>
-          <w:p wp14:textId="77777777">
+          </w:tcPr>
+          <w:p>
             <w:pPr>
               <w:pStyle w:val="TableParagraph"/>
               <w:rPr>
@@ -2903,22 +2715,23 @@
         </w:tc>
       </w:tr>
     </w:tbl>
+    <w:p/>
     <w:sectPr>
       <w:type w:val="continuous"/>
-      <w:pgSz w:w="11920" w:h="16850" w:orient="portrait"/>
-      <w:pgMar w:top="680" w:right="425" w:bottom="280" w:left="708"/>
-      <w:cols w:num="1"/>
+      <w:pgSz w:w="11920" w:h="16850"/>
+      <w:pgMar w:top="680" w:right="425" w:bottom="280" w:left="708" w:header="720" w:footer="720" w:gutter="0"/>
+      <w:cols w:space="720"/>
     </w:sectPr>
   </w:body>
 </w:document>
 </file>
 
 <file path=word/styles.xml><?xml version="1.0" encoding="utf-8"?>
-<w:styles xmlns:w14="http://schemas.microsoft.com/office/word/2010/wordml" xmlns:wp14="http://schemas.microsoft.com/office/word/2010/wordprocessingDrawing" xmlns:r="http://schemas.openxmlformats.org/officeDocument/2006/relationships" xmlns:w="http://schemas.openxmlformats.org/wordprocessingml/2006/main" xmlns:mc="http://schemas.openxmlformats.org/markup-compatibility/2006" mc:Ignorable="w14 wp14">
+<w:styles xmlns:mc="http://schemas.openxmlformats.org/markup-compatibility/2006" xmlns:r="http://schemas.openxmlformats.org/officeDocument/2006/relationships" xmlns:w="http://schemas.openxmlformats.org/wordprocessingml/2006/main" xmlns:w14="http://schemas.microsoft.com/office/word/2010/wordml" xmlns:w15="http://schemas.microsoft.com/office/word/2012/wordml" xmlns:w16cex="http://schemas.microsoft.com/office/word/2018/wordml/cex" xmlns:w16cid="http://schemas.microsoft.com/office/word/2016/wordml/cid" xmlns:w16="http://schemas.microsoft.com/office/word/2018/wordml" xmlns:w16du="http://schemas.microsoft.com/office/word/2023/wordml/word16du" xmlns:w16sdtdh="http://schemas.microsoft.com/office/word/2020/wordml/sdtdatahash" xmlns:w16sdtfl="http://schemas.microsoft.com/office/word/2024/wordml/sdtformatlock" xmlns:w16se="http://schemas.microsoft.com/office/word/2015/wordml/symex" mc:Ignorable="w14 w15 w16se w16cid w16 w16cex w16sdtdh w16sdtfl w16du">
   <w:docDefaults>
     <w:rPrDefault>
       <w:rPr>
-        <w:rFonts w:asciiTheme="minorHAnsi" w:hAnsiTheme="minorHAnsi" w:eastAsiaTheme="minorHAnsi" w:cstheme="minorBidi"/>
+        <w:rFonts w:asciiTheme="minorHAnsi" w:eastAsiaTheme="minorHAnsi" w:hAnsiTheme="minorHAnsi" w:cstheme="minorBidi"/>
         <w:sz w:val="22"/>
         <w:szCs w:val="22"/>
         <w:lang w:val="en-US" w:eastAsia="en-US" w:bidi="ar-SA"/>
@@ -2929,101 +2742,455 @@
         <w:widowControl w:val="0"/>
         <w:autoSpaceDE w:val="0"/>
         <w:autoSpaceDN w:val="0"/>
-        <w:spacing w:before="0" w:after="0" w:line="240" w:lineRule="auto"/>
-        <w:ind w:left="0" w:right="0"/>
-        <w:jc w:val="left"/>
       </w:pPr>
     </w:pPrDefault>
   </w:docDefaults>
-  <w:style w:type="character" w:styleId="DefaultParagraphFont" w:default="1">
+  <w:latentStyles w:defLockedState="0" w:defUIPriority="99" w:defSemiHidden="0" w:defUnhideWhenUsed="0" w:defQFormat="0" w:count="376">
+    <w:lsdException w:name="Normal" w:uiPriority="0" w:qFormat="1"/>
+    <w:lsdException w:name="heading 1" w:uiPriority="9" w:qFormat="1"/>
+    <w:lsdException w:name="heading 2" w:semiHidden="1" w:uiPriority="9" w:unhideWhenUsed="1" w:qFormat="1"/>
+    <w:lsdException w:name="heading 3" w:semiHidden="1" w:uiPriority="9" w:unhideWhenUsed="1" w:qFormat="1"/>
+    <w:lsdException w:name="heading 4" w:semiHidden="1" w:uiPriority="9" w:unhideWhenUsed="1" w:qFormat="1"/>
+    <w:lsdException w:name="heading 5" w:semiHidden="1" w:uiPriority="9" w:unhideWhenUsed="1" w:qFormat="1"/>
+    <w:lsdException w:name="heading 6" w:semiHidden="1" w:uiPriority="9" w:unhideWhenUsed="1" w:qFormat="1"/>
+    <w:lsdException w:name="heading 7" w:semiHidden="1" w:uiPriority="9" w:unhideWhenUsed="1" w:qFormat="1"/>
+    <w:lsdException w:name="heading 8" w:semiHidden="1" w:uiPriority="9" w:unhideWhenUsed="1" w:qFormat="1"/>
+    <w:lsdException w:name="heading 9" w:semiHidden="1" w:uiPriority="9" w:unhideWhenUsed="1" w:qFormat="1"/>
+    <w:lsdException w:name="index 1" w:semiHidden="1" w:unhideWhenUsed="1"/>
+    <w:lsdException w:name="index 2" w:semiHidden="1" w:unhideWhenUsed="1"/>
+    <w:lsdException w:name="index 3" w:semiHidden="1" w:unhideWhenUsed="1"/>
+    <w:lsdException w:name="index 4" w:semiHidden="1" w:unhideWhenUsed="1"/>
+    <w:lsdException w:name="index 5" w:semiHidden="1" w:unhideWhenUsed="1"/>
+    <w:lsdException w:name="index 6" w:semiHidden="1" w:unhideWhenUsed="1"/>
+    <w:lsdException w:name="index 7" w:semiHidden="1" w:unhideWhenUsed="1"/>
+    <w:lsdException w:name="index 8" w:semiHidden="1" w:unhideWhenUsed="1"/>
+    <w:lsdException w:name="index 9" w:semiHidden="1" w:unhideWhenUsed="1"/>
+    <w:lsdException w:name="toc 1" w:semiHidden="1" w:uiPriority="39" w:unhideWhenUsed="1"/>
+    <w:lsdException w:name="toc 2" w:semiHidden="1" w:uiPriority="39" w:unhideWhenUsed="1"/>
+    <w:lsdException w:name="toc 3" w:semiHidden="1" w:uiPriority="39" w:unhideWhenUsed="1"/>
+    <w:lsdException w:name="toc 4" w:semiHidden="1" w:uiPriority="39" w:unhideWhenUsed="1"/>
+    <w:lsdException w:name="toc 5" w:semiHidden="1" w:uiPriority="39" w:unhideWhenUsed="1"/>
+    <w:lsdException w:name="toc 6" w:semiHidden="1" w:uiPriority="39" w:unhideWhenUsed="1"/>
+    <w:lsdException w:name="toc 7" w:semiHidden="1" w:uiPriority="39" w:unhideWhenUsed="1"/>
+    <w:lsdException w:name="toc 8" w:semiHidden="1" w:uiPriority="39" w:unhideWhenUsed="1"/>
+    <w:lsdException w:name="toc 9" w:semiHidden="1" w:uiPriority="39" w:unhideWhenUsed="1"/>
+    <w:lsdException w:name="Normal Indent" w:semiHidden="1" w:unhideWhenUsed="1"/>
+    <w:lsdException w:name="footnote text" w:semiHidden="1" w:unhideWhenUsed="1"/>
+    <w:lsdException w:name="annotation text" w:semiHidden="1" w:unhideWhenUsed="1"/>
+    <w:lsdException w:name="header" w:semiHidden="1" w:unhideWhenUsed="1"/>
+    <w:lsdException w:name="footer" w:semiHidden="1" w:unhideWhenUsed="1"/>
+    <w:lsdException w:name="index heading" w:semiHidden="1" w:unhideWhenUsed="1"/>
+    <w:lsdException w:name="caption" w:semiHidden="1" w:uiPriority="35" w:unhideWhenUsed="1" w:qFormat="1"/>
+    <w:lsdException w:name="table of figures" w:semiHidden="1" w:unhideWhenUsed="1"/>
+    <w:lsdException w:name="envelope address" w:semiHidden="1" w:unhideWhenUsed="1"/>
+    <w:lsdException w:name="envelope return" w:semiHidden="1" w:unhideWhenUsed="1"/>
+    <w:lsdException w:name="footnote reference" w:semiHidden="1" w:unhideWhenUsed="1"/>
+    <w:lsdException w:name="annotation reference" w:semiHidden="1" w:unhideWhenUsed="1"/>
+    <w:lsdException w:name="line number" w:semiHidden="1" w:unhideWhenUsed="1"/>
+    <w:lsdException w:name="page number" w:semiHidden="1" w:unhideWhenUsed="1"/>
+    <w:lsdException w:name="endnote reference" w:semiHidden="1" w:unhideWhenUsed="1"/>
+    <w:lsdException w:name="endnote text" w:semiHidden="1" w:unhideWhenUsed="1"/>
+    <w:lsdException w:name="table of authorities" w:semiHidden="1" w:unhideWhenUsed="1"/>
+    <w:lsdException w:name="macro" w:semiHidden="1" w:unhideWhenUsed="1"/>
+    <w:lsdException w:name="toa heading" w:semiHidden="1" w:unhideWhenUsed="1"/>
+    <w:lsdException w:name="List" w:semiHidden="1" w:unhideWhenUsed="1"/>
+    <w:lsdException w:name="List Bullet" w:semiHidden="1" w:unhideWhenUsed="1"/>
+    <w:lsdException w:name="List Number" w:semiHidden="1" w:unhideWhenUsed="1"/>
+    <w:lsdException w:name="List 2" w:semiHidden="1" w:unhideWhenUsed="1"/>
+    <w:lsdException w:name="List 3" w:semiHidden="1" w:unhideWhenUsed="1"/>
+    <w:lsdException w:name="List 4" w:semiHidden="1" w:unhideWhenUsed="1"/>
+    <w:lsdException w:name="List 5" w:semiHidden="1" w:unhideWhenUsed="1"/>
+    <w:lsdException w:name="List Bullet 2" w:semiHidden="1" w:unhideWhenUsed="1"/>
+    <w:lsdException w:name="List Bullet 3" w:semiHidden="1" w:unhideWhenUsed="1"/>
+    <w:lsdException w:name="List Bullet 4" w:semiHidden="1" w:unhideWhenUsed="1"/>
+    <w:lsdException w:name="List Bullet 5" w:semiHidden="1" w:unhideWhenUsed="1"/>
+    <w:lsdException w:name="List Number 2" w:semiHidden="1" w:unhideWhenUsed="1"/>
+    <w:lsdException w:name="List Number 3" w:semiHidden="1" w:unhideWhenUsed="1"/>
+    <w:lsdException w:name="List Number 4" w:semiHidden="1" w:unhideWhenUsed="1"/>
+    <w:lsdException w:name="List Number 5" w:semiHidden="1" w:unhideWhenUsed="1"/>
+    <w:lsdException w:name="Title" w:uiPriority="10" w:qFormat="1"/>
+    <w:lsdException w:name="Closing" w:semiHidden="1" w:unhideWhenUsed="1"/>
+    <w:lsdException w:name="Signature" w:semiHidden="1" w:unhideWhenUsed="1"/>
+    <w:lsdException w:name="Default Paragraph Font" w:semiHidden="1" w:uiPriority="1" w:unhideWhenUsed="1"/>
+    <w:lsdException w:name="Body Text" w:semiHidden="1" w:unhideWhenUsed="1"/>
+    <w:lsdException w:name="Body Text Indent" w:semiHidden="1" w:unhideWhenUsed="1"/>
+    <w:lsdException w:name="List Continue" w:semiHidden="1" w:unhideWhenUsed="1"/>
+    <w:lsdException w:name="List Continue 2" w:semiHidden="1" w:unhideWhenUsed="1"/>
+    <w:lsdException w:name="List Continue 3" w:semiHidden="1" w:unhideWhenUsed="1"/>
+    <w:lsdException w:name="List Continue 4" w:semiHidden="1" w:unhideWhenUsed="1"/>
+    <w:lsdException w:name="List Continue 5" w:semiHidden="1" w:unhideWhenUsed="1"/>
+    <w:lsdException w:name="Message Header" w:semiHidden="1" w:unhideWhenUsed="1"/>
+    <w:lsdException w:name="Subtitle" w:uiPriority="11" w:qFormat="1"/>
+    <w:lsdException w:name="Salutation" w:semiHidden="1" w:unhideWhenUsed="1"/>
+    <w:lsdException w:name="Date" w:semiHidden="1" w:unhideWhenUsed="1"/>
+    <w:lsdException w:name="Body Text First Indent" w:semiHidden="1" w:unhideWhenUsed="1"/>
+    <w:lsdException w:name="Body Text First Indent 2" w:semiHidden="1" w:unhideWhenUsed="1"/>
+    <w:lsdException w:name="Note Heading" w:semiHidden="1" w:unhideWhenUsed="1"/>
+    <w:lsdException w:name="Body Text 2" w:semiHidden="1" w:unhideWhenUsed="1"/>
+    <w:lsdException w:name="Body Text 3" w:semiHidden="1" w:unhideWhenUsed="1"/>
+    <w:lsdException w:name="Body Text Indent 2" w:semiHidden="1" w:unhideWhenUsed="1"/>
+    <w:lsdException w:name="Body Text Indent 3" w:semiHidden="1" w:unhideWhenUsed="1"/>
+    <w:lsdException w:name="Block Text" w:semiHidden="1" w:unhideWhenUsed="1"/>
+    <w:lsdException w:name="Hyperlink" w:semiHidden="1" w:unhideWhenUsed="1"/>
+    <w:lsdException w:name="FollowedHyperlink" w:semiHidden="1" w:unhideWhenUsed="1"/>
+    <w:lsdException w:name="Strong" w:uiPriority="22" w:qFormat="1"/>
+    <w:lsdException w:name="Emphasis" w:uiPriority="20" w:qFormat="1"/>
+    <w:lsdException w:name="Document Map" w:semiHidden="1" w:unhideWhenUsed="1"/>
+    <w:lsdException w:name="Plain Text" w:semiHidden="1" w:unhideWhenUsed="1"/>
+    <w:lsdException w:name="E-mail Signature" w:semiHidden="1" w:unhideWhenUsed="1"/>
+    <w:lsdException w:name="HTML Top of Form" w:semiHidden="1" w:unhideWhenUsed="1"/>
+    <w:lsdException w:name="HTML Bottom of Form" w:semiHidden="1" w:unhideWhenUsed="1"/>
+    <w:lsdException w:name="Normal (Web)" w:semiHidden="1" w:unhideWhenUsed="1"/>
+    <w:lsdException w:name="HTML Acronym" w:semiHidden="1" w:unhideWhenUsed="1"/>
+    <w:lsdException w:name="HTML Address" w:semiHidden="1" w:unhideWhenUsed="1"/>
+    <w:lsdException w:name="HTML Cite" w:semiHidden="1" w:unhideWhenUsed="1"/>
+    <w:lsdException w:name="HTML Code" w:semiHidden="1" w:unhideWhenUsed="1"/>
+    <w:lsdException w:name="HTML Definition" w:semiHidden="1" w:unhideWhenUsed="1"/>
+    <w:lsdException w:name="HTML Keyboard" w:semiHidden="1" w:unhideWhenUsed="1"/>
+    <w:lsdException w:name="HTML Preformatted" w:semiHidden="1" w:unhideWhenUsed="1"/>
+    <w:lsdException w:name="HTML Sample" w:semiHidden="1" w:unhideWhenUsed="1"/>
+    <w:lsdException w:name="HTML Typewriter" w:semiHidden="1" w:unhideWhenUsed="1"/>
+    <w:lsdException w:name="HTML Variable" w:semiHidden="1" w:unhideWhenUsed="1"/>
+    <w:lsdException w:name="Normal Table" w:semiHidden="1" w:unhideWhenUsed="1"/>
+    <w:lsdException w:name="annotation subject" w:semiHidden="1" w:unhideWhenUsed="1"/>
+    <w:lsdException w:name="No List" w:semiHidden="1" w:unhideWhenUsed="1"/>
+    <w:lsdException w:name="Outline List 1" w:semiHidden="1" w:unhideWhenUsed="1"/>
+    <w:lsdException w:name="Outline List 2" w:semiHidden="1" w:unhideWhenUsed="1"/>
+    <w:lsdException w:name="Outline List 3" w:semiHidden="1" w:unhideWhenUsed="1"/>
+    <w:lsdException w:name="Table Simple 1" w:semiHidden="1" w:unhideWhenUsed="1"/>
+    <w:lsdException w:name="Table Simple 2" w:semiHidden="1" w:unhideWhenUsed="1"/>
+    <w:lsdException w:name="Table Simple 3" w:semiHidden="1" w:unhideWhenUsed="1"/>
+    <w:lsdException w:name="Table Classic 1" w:semiHidden="1" w:unhideWhenUsed="1"/>
+    <w:lsdException w:name="Table Classic 2" w:semiHidden="1" w:unhideWhenUsed="1"/>
+    <w:lsdException w:name="Table Classic 3" w:semiHidden="1" w:unhideWhenUsed="1"/>
+    <w:lsdException w:name="Table Classic 4" w:semiHidden="1" w:unhideWhenUsed="1"/>
+    <w:lsdException w:name="Table Colorful 1" w:semiHidden="1" w:unhideWhenUsed="1"/>
+    <w:lsdException w:name="Table Colorful 2" w:semiHidden="1" w:unhideWhenUsed="1"/>
+    <w:lsdException w:name="Table Colorful 3" w:semiHidden="1" w:unhideWhenUsed="1"/>
+    <w:lsdException w:name="Table Columns 1" w:semiHidden="1" w:unhideWhenUsed="1"/>
+    <w:lsdException w:name="Table Columns 2" w:semiHidden="1" w:unhideWhenUsed="1"/>
+    <w:lsdException w:name="Table Columns 3" w:semiHidden="1" w:unhideWhenUsed="1"/>
+    <w:lsdException w:name="Table Columns 4" w:semiHidden="1" w:unhideWhenUsed="1"/>
+    <w:lsdException w:name="Table Columns 5" w:semiHidden="1" w:unhideWhenUsed="1"/>
+    <w:lsdException w:name="Table Grid 1" w:semiHidden="1" w:unhideWhenUsed="1"/>
+    <w:lsdException w:name="Table Grid 2" w:semiHidden="1" w:unhideWhenUsed="1"/>
+    <w:lsdException w:name="Table Grid 3" w:semiHidden="1" w:unhideWhenUsed="1"/>
+    <w:lsdException w:name="Table Grid 4" w:semiHidden="1" w:unhideWhenUsed="1"/>
+    <w:lsdException w:name="Table Grid 5" w:semiHidden="1" w:unhideWhenUsed="1"/>
+    <w:lsdException w:name="Table Grid 6" w:semiHidden="1" w:unhideWhenUsed="1"/>
+    <w:lsdException w:name="Table Grid 7" w:semiHidden="1" w:unhideWhenUsed="1"/>
+    <w:lsdException w:name="Table Grid 8" w:semiHidden="1" w:unhideWhenUsed="1"/>
+    <w:lsdException w:name="Table List 1" w:semiHidden="1" w:unhideWhenUsed="1"/>
+    <w:lsdException w:name="Table List 2" w:semiHidden="1" w:unhideWhenUsed="1"/>
+    <w:lsdException w:name="Table List 3" w:semiHidden="1" w:unhideWhenUsed="1"/>
+    <w:lsdException w:name="Table List 4" w:semiHidden="1" w:unhideWhenUsed="1"/>
+    <w:lsdException w:name="Table List 5" w:semiHidden="1" w:unhideWhenUsed="1"/>
+    <w:lsdException w:name="Table List 6" w:semiHidden="1" w:unhideWhenUsed="1"/>
+    <w:lsdException w:name="Table List 7" w:semiHidden="1" w:unhideWhenUsed="1"/>
+    <w:lsdException w:name="Table List 8" w:semiHidden="1" w:unhideWhenUsed="1"/>
+    <w:lsdException w:name="Table 3D effects 1" w:semiHidden="1" w:unhideWhenUsed="1"/>
+    <w:lsdException w:name="Table 3D effects 2" w:semiHidden="1" w:unhideWhenUsed="1"/>
+    <w:lsdException w:name="Table 3D effects 3" w:semiHidden="1" w:unhideWhenUsed="1"/>
+    <w:lsdException w:name="Table Contemporary" w:semiHidden="1" w:unhideWhenUsed="1"/>
+    <w:lsdException w:name="Table Elegant" w:semiHidden="1" w:unhideWhenUsed="1"/>
+    <w:lsdException w:name="Table Professional" w:semiHidden="1" w:unhideWhenUsed="1"/>
+    <w:lsdException w:name="Table Subtle 1" w:semiHidden="1" w:unhideWhenUsed="1"/>
+    <w:lsdException w:name="Table Subtle 2" w:semiHidden="1" w:unhideWhenUsed="1"/>
+    <w:lsdException w:name="Table Web 1" w:semiHidden="1" w:unhideWhenUsed="1"/>
+    <w:lsdException w:name="Table Web 2" w:semiHidden="1" w:unhideWhenUsed="1"/>
+    <w:lsdException w:name="Table Web 3" w:semiHidden="1" w:unhideWhenUsed="1"/>
+    <w:lsdException w:name="Balloon Text" w:semiHidden="1" w:unhideWhenUsed="1"/>
+    <w:lsdException w:name="Table Grid" w:uiPriority="39"/>
+    <w:lsdException w:name="Table Theme" w:semiHidden="1" w:unhideWhenUsed="1"/>
+    <w:lsdException w:name="Placeholder Text" w:semiHidden="1"/>
+    <w:lsdException w:name="No Spacing" w:uiPriority="1" w:qFormat="1"/>
+    <w:lsdException w:name="Light Shading" w:uiPriority="60"/>
+    <w:lsdException w:name="Light List" w:uiPriority="61"/>
+    <w:lsdException w:name="Light Grid" w:uiPriority="62"/>
+    <w:lsdException w:name="Medium Shading 1" w:uiPriority="63"/>
+    <w:lsdException w:name="Medium Shading 2" w:uiPriority="64"/>
+    <w:lsdException w:name="Medium List 1" w:uiPriority="65"/>
+    <w:lsdException w:name="Medium List 2" w:uiPriority="66"/>
+    <w:lsdException w:name="Medium Grid 1" w:uiPriority="67"/>
+    <w:lsdException w:name="Medium Grid 2" w:uiPriority="68"/>
+    <w:lsdException w:name="Medium Grid 3" w:uiPriority="69"/>
+    <w:lsdException w:name="Dark List" w:uiPriority="70"/>
+    <w:lsdException w:name="Colorful Shading" w:uiPriority="71"/>
+    <w:lsdException w:name="Colorful List" w:uiPriority="72"/>
+    <w:lsdException w:name="Colorful Grid" w:uiPriority="73"/>
+    <w:lsdException w:name="Light Shading Accent 1" w:uiPriority="60"/>
+    <w:lsdException w:name="Light List Accent 1" w:uiPriority="61"/>
+    <w:lsdException w:name="Light Grid Accent 1" w:uiPriority="62"/>
+    <w:lsdException w:name="Medium Shading 1 Accent 1" w:uiPriority="63"/>
+    <w:lsdException w:name="Medium Shading 2 Accent 1" w:uiPriority="64"/>
+    <w:lsdException w:name="Medium List 1 Accent 1" w:uiPriority="65"/>
+    <w:lsdException w:name="Revision" w:semiHidden="1"/>
+    <w:lsdException w:name="List Paragraph" w:uiPriority="34" w:qFormat="1"/>
+    <w:lsdException w:name="Quote" w:uiPriority="29" w:qFormat="1"/>
+    <w:lsdException w:name="Intense Quote" w:uiPriority="30" w:qFormat="1"/>
+    <w:lsdException w:name="Medium List 2 Accent 1" w:uiPriority="66"/>
+    <w:lsdException w:name="Medium Grid 1 Accent 1" w:uiPriority="67"/>
+    <w:lsdException w:name="Medium Grid 2 Accent 1" w:uiPriority="68"/>
+    <w:lsdException w:name="Medium Grid 3 Accent 1" w:uiPriority="69"/>
+    <w:lsdException w:name="Dark List Accent 1" w:uiPriority="70"/>
+    <w:lsdException w:name="Colorful Shading Accent 1" w:uiPriority="71"/>
+    <w:lsdException w:name="Colorful List Accent 1" w:uiPriority="72"/>
+    <w:lsdException w:name="Colorful Grid Accent 1" w:uiPriority="73"/>
+    <w:lsdException w:name="Light Shading Accent 2" w:uiPriority="60"/>
+    <w:lsdException w:name="Light List Accent 2" w:uiPriority="61"/>
+    <w:lsdException w:name="Light Grid Accent 2" w:uiPriority="62"/>
+    <w:lsdException w:name="Medium Shading 1 Accent 2" w:uiPriority="63"/>
+    <w:lsdException w:name="Medium Shading 2 Accent 2" w:uiPriority="64"/>
+    <w:lsdException w:name="Medium List 1 Accent 2" w:uiPriority="65"/>
+    <w:lsdException w:name="Medium List 2 Accent 2" w:uiPriority="66"/>
+    <w:lsdException w:name="Medium Grid 1 Accent 2" w:uiPriority="67"/>
+    <w:lsdException w:name="Medium Grid 2 Accent 2" w:uiPriority="68"/>
+    <w:lsdException w:name="Medium Grid 3 Accent 2" w:uiPriority="69"/>
+    <w:lsdException w:name="Dark List Accent 2" w:uiPriority="70"/>
+    <w:lsdException w:name="Colorful Shading Accent 2" w:uiPriority="71"/>
+    <w:lsdException w:name="Colorful List Accent 2" w:uiPriority="72"/>
+    <w:lsdException w:name="Colorful Grid Accent 2" w:uiPriority="73"/>
+    <w:lsdException w:name="Light Shading Accent 3" w:uiPriority="60"/>
+    <w:lsdException w:name="Light List Accent 3" w:uiPriority="61"/>
+    <w:lsdException w:name="Light Grid Accent 3" w:uiPriority="62"/>
+    <w:lsdException w:name="Medium Shading 1 Accent 3" w:uiPriority="63"/>
+    <w:lsdException w:name="Medium Shading 2 Accent 3" w:uiPriority="64"/>
+    <w:lsdException w:name="Medium List 1 Accent 3" w:uiPriority="65"/>
+    <w:lsdException w:name="Medium List 2 Accent 3" w:uiPriority="66"/>
+    <w:lsdException w:name="Medium Grid 1 Accent 3" w:uiPriority="67"/>
+    <w:lsdException w:name="Medium Grid 2 Accent 3" w:uiPriority="68"/>
+    <w:lsdException w:name="Medium Grid 3 Accent 3" w:uiPriority="69"/>
+    <w:lsdException w:name="Dark List Accent 3" w:uiPriority="70"/>
+    <w:lsdException w:name="Colorful Shading Accent 3" w:uiPriority="71"/>
+    <w:lsdException w:name="Colorful List Accent 3" w:uiPriority="72"/>
+    <w:lsdException w:name="Colorful Grid Accent 3" w:uiPriority="73"/>
+    <w:lsdException w:name="Light Shading Accent 4" w:uiPriority="60"/>
+    <w:lsdException w:name="Light List Accent 4" w:uiPriority="61"/>
+    <w:lsdException w:name="Light Grid Accent 4" w:uiPriority="62"/>
+    <w:lsdException w:name="Medium Shading 1 Accent 4" w:uiPriority="63"/>
+    <w:lsdException w:name="Medium Shading 2 Accent 4" w:uiPriority="64"/>
+    <w:lsdException w:name="Medium List 1 Accent 4" w:uiPriority="65"/>
+    <w:lsdException w:name="Medium List 2 Accent 4" w:uiPriority="66"/>
+    <w:lsdException w:name="Medium Grid 1 Accent 4" w:uiPriority="67"/>
+    <w:lsdException w:name="Medium Grid 2 Accent 4" w:uiPriority="68"/>
+    <w:lsdException w:name="Medium Grid 3 Accent 4" w:uiPriority="69"/>
+    <w:lsdException w:name="Dark List Accent 4" w:uiPriority="70"/>
+    <w:lsdException w:name="Colorful Shading Accent 4" w:uiPriority="71"/>
+    <w:lsdException w:name="Colorful List Accent 4" w:uiPriority="72"/>
+    <w:lsdException w:name="Colorful Grid Accent 4" w:uiPriority="73"/>
+    <w:lsdException w:name="Light Shading Accent 5" w:uiPriority="60"/>
+    <w:lsdException w:name="Light List Accent 5" w:uiPriority="61"/>
+    <w:lsdException w:name="Light Grid Accent 5" w:uiPriority="62"/>
+    <w:lsdException w:name="Medium Shading 1 Accent 5" w:uiPriority="63"/>
+    <w:lsdException w:name="Medium Shading 2 Accent 5" w:uiPriority="64"/>
+    <w:lsdException w:name="Medium List 1 Accent 5" w:uiPriority="65"/>
+    <w:lsdException w:name="Medium List 2 Accent 5" w:uiPriority="66"/>
+    <w:lsdException w:name="Medium Grid 1 Accent 5" w:uiPriority="67"/>
+    <w:lsdException w:name="Medium Grid 2 Accent 5" w:uiPriority="68"/>
+    <w:lsdException w:name="Medium Grid 3 Accent 5" w:uiPriority="69"/>
+    <w:lsdException w:name="Dark List Accent 5" w:uiPriority="70"/>
+    <w:lsdException w:name="Colorful Shading Accent 5" w:uiPriority="71"/>
+    <w:lsdException w:name="Colorful List Accent 5" w:uiPriority="72"/>
+    <w:lsdException w:name="Colorful Grid Accent 5" w:uiPriority="73"/>
+    <w:lsdException w:name="Light Shading Accent 6" w:uiPriority="60"/>
+    <w:lsdException w:name="Light List Accent 6" w:uiPriority="61"/>
+    <w:lsdException w:name="Light Grid Accent 6" w:uiPriority="62"/>
+    <w:lsdException w:name="Medium Shading 1 Accent 6" w:uiPriority="63"/>
+    <w:lsdException w:name="Medium Shading 2 Accent 6" w:uiPriority="64"/>
+    <w:lsdException w:name="Medium List 1 Accent 6" w:uiPriority="65"/>
+    <w:lsdException w:name="Medium List 2 Accent 6" w:uiPriority="66"/>
+    <w:lsdException w:name="Medium Grid 1 Accent 6" w:uiPriority="67"/>
+    <w:lsdException w:name="Medium Grid 2 Accent 6" w:uiPriority="68"/>
+    <w:lsdException w:name="Medium Grid 3 Accent 6" w:uiPriority="69"/>
+    <w:lsdException w:name="Dark List Accent 6" w:uiPriority="70"/>
+    <w:lsdException w:name="Colorful Shading Accent 6" w:uiPriority="71"/>
+    <w:lsdException w:name="Colorful List Accent 6" w:uiPriority="72"/>
+    <w:lsdException w:name="Colorful Grid Accent 6" w:uiPriority="73"/>
+    <w:lsdException w:name="Subtle Emphasis" w:uiPriority="19" w:qFormat="1"/>
+    <w:lsdException w:name="Intense Emphasis" w:uiPriority="21" w:qFormat="1"/>
+    <w:lsdException w:name="Subtle Reference" w:uiPriority="31" w:qFormat="1"/>
+    <w:lsdException w:name="Intense Reference" w:uiPriority="32" w:qFormat="1"/>
+    <w:lsdException w:name="Book Title" w:uiPriority="33" w:qFormat="1"/>
+    <w:lsdException w:name="Bibliography" w:semiHidden="1" w:uiPriority="37" w:unhideWhenUsed="1"/>
+    <w:lsdException w:name="TOC Heading" w:semiHidden="1" w:uiPriority="39" w:unhideWhenUsed="1" w:qFormat="1"/>
+    <w:lsdException w:name="Plain Table 1" w:uiPriority="41"/>
+    <w:lsdException w:name="Plain Table 2" w:uiPriority="42"/>
+    <w:lsdException w:name="Plain Table 3" w:uiPriority="43"/>
+    <w:lsdException w:name="Plain Table 4" w:uiPriority="44"/>
+    <w:lsdException w:name="Plain Table 5" w:uiPriority="45"/>
+    <w:lsdException w:name="Grid Table Light" w:uiPriority="40"/>
+    <w:lsdException w:name="Grid Table 1 Light" w:uiPriority="46"/>
+    <w:lsdException w:name="Grid Table 2" w:uiPriority="47"/>
+    <w:lsdException w:name="Grid Table 3" w:uiPriority="48"/>
+    <w:lsdException w:name="Grid Table 4" w:uiPriority="49"/>
+    <w:lsdException w:name="Grid Table 5 Dark" w:uiPriority="50"/>
+    <w:lsdException w:name="Grid Table 6 Colorful" w:uiPriority="51"/>
+    <w:lsdException w:name="Grid Table 7 Colorful" w:uiPriority="52"/>
+    <w:lsdException w:name="Grid Table 1 Light Accent 1" w:uiPriority="46"/>
+    <w:lsdException w:name="Grid Table 2 Accent 1" w:uiPriority="47"/>
+    <w:lsdException w:name="Grid Table 3 Accent 1" w:uiPriority="48"/>
+    <w:lsdException w:name="Grid Table 4 Accent 1" w:uiPriority="49"/>
+    <w:lsdException w:name="Grid Table 5 Dark Accent 1" w:uiPriority="50"/>
+    <w:lsdException w:name="Grid Table 6 Colorful Accent 1" w:uiPriority="51"/>
+    <w:lsdException w:name="Grid Table 7 Colorful Accent 1" w:uiPriority="52"/>
+    <w:lsdException w:name="Grid Table 1 Light Accent 2" w:uiPriority="46"/>
+    <w:lsdException w:name="Grid Table 2 Accent 2" w:uiPriority="47"/>
+    <w:lsdException w:name="Grid Table 3 Accent 2" w:uiPriority="48"/>
+    <w:lsdException w:name="Grid Table 4 Accent 2" w:uiPriority="49"/>
+    <w:lsdException w:name="Grid Table 5 Dark Accent 2" w:uiPriority="50"/>
+    <w:lsdException w:name="Grid Table 6 Colorful Accent 2" w:uiPriority="51"/>
+    <w:lsdException w:name="Grid Table 7 Colorful Accent 2" w:uiPriority="52"/>
+    <w:lsdException w:name="Grid Table 1 Light Accent 3" w:uiPriority="46"/>
+    <w:lsdException w:name="Grid Table 2 Accent 3" w:uiPriority="47"/>
+    <w:lsdException w:name="Grid Table 3 Accent 3" w:uiPriority="48"/>
+    <w:lsdException w:name="Grid Table 4 Accent 3" w:uiPriority="49"/>
+    <w:lsdException w:name="Grid Table 5 Dark Accent 3" w:uiPriority="50"/>
+    <w:lsdException w:name="Grid Table 6 Colorful Accent 3" w:uiPriority="51"/>
+    <w:lsdException w:name="Grid Table 7 Colorful Accent 3" w:uiPriority="52"/>
+    <w:lsdException w:name="Grid Table 1 Light Accent 4" w:uiPriority="46"/>
+    <w:lsdException w:name="Grid Table 2 Accent 4" w:uiPriority="47"/>
+    <w:lsdException w:name="Grid Table 3 Accent 4" w:uiPriority="48"/>
+    <w:lsdException w:name="Grid Table 4 Accent 4" w:uiPriority="49"/>
+    <w:lsdException w:name="Grid Table 5 Dark Accent 4" w:uiPriority="50"/>
+    <w:lsdException w:name="Grid Table 6 Colorful Accent 4" w:uiPriority="51"/>
+    <w:lsdException w:name="Grid Table 7 Colorful Accent 4" w:uiPriority="52"/>
+    <w:lsdException w:name="Grid Table 1 Light Accent 5" w:uiPriority="46"/>
+    <w:lsdException w:name="Grid Table 2 Accent 5" w:uiPriority="47"/>
+    <w:lsdException w:name="Grid Table 3 Accent 5" w:uiPriority="48"/>
+    <w:lsdException w:name="Grid Table 4 Accent 5" w:uiPriority="49"/>
+    <w:lsdException w:name="Grid Table 5 Dark Accent 5" w:uiPriority="50"/>
+    <w:lsdException w:name="Grid Table 6 Colorful Accent 5" w:uiPriority="51"/>
+    <w:lsdException w:name="Grid Table 7 Colorful Accent 5" w:uiPriority="52"/>
+    <w:lsdException w:name="Grid Table 1 Light Accent 6" w:uiPriority="46"/>
+    <w:lsdException w:name="Grid Table 2 Accent 6" w:uiPriority="47"/>
+    <w:lsdException w:name="Grid Table 3 Accent 6" w:uiPriority="48"/>
+    <w:lsdException w:name="Grid Table 4 Accent 6" w:uiPriority="49"/>
+    <w:lsdException w:name="Grid Table 5 Dark Accent 6" w:uiPriority="50"/>
+    <w:lsdException w:name="Grid Table 6 Colorful Accent 6" w:uiPriority="51"/>
+    <w:lsdException w:name="Grid Table 7 Colorful Accent 6" w:uiPriority="52"/>
+    <w:lsdException w:name="List Table 1 Light" w:uiPriority="46"/>
+    <w:lsdException w:name="List Table 2" w:uiPriority="47"/>
+    <w:lsdException w:name="List Table 3" w:uiPriority="48"/>
+    <w:lsdException w:name="List Table 4" w:uiPriority="49"/>
+    <w:lsdException w:name="List Table 5 Dark" w:uiPriority="50"/>
+    <w:lsdException w:name="List Table 6 Colorful" w:uiPriority="51"/>
+    <w:lsdException w:name="List Table 7 Colorful" w:uiPriority="52"/>
+    <w:lsdException w:name="List Table 1 Light Accent 1" w:uiPriority="46"/>
+    <w:lsdException w:name="List Table 2 Accent 1" w:uiPriority="47"/>
+    <w:lsdException w:name="List Table 3 Accent 1" w:uiPriority="48"/>
+    <w:lsdException w:name="List Table 4 Accent 1" w:uiPriority="49"/>
+    <w:lsdException w:name="List Table 5 Dark Accent 1" w:uiPriority="50"/>
+    <w:lsdException w:name="List Table 6 Colorful Accent 1" w:uiPriority="51"/>
+    <w:lsdException w:name="List Table 7 Colorful Accent 1" w:uiPriority="52"/>
+    <w:lsdException w:name="List Table 1 Light Accent 2" w:uiPriority="46"/>
+    <w:lsdException w:name="List Table 2 Accent 2" w:uiPriority="47"/>
+    <w:lsdException w:name="List Table 3 Accent 2" w:uiPriority="48"/>
+    <w:lsdException w:name="List Table 4 Accent 2" w:uiPriority="49"/>
+    <w:lsdException w:name="List Table 5 Dark Accent 2" w:uiPriority="50"/>
+    <w:lsdException w:name="List Table 6 Colorful Accent 2" w:uiPriority="51"/>
+    <w:lsdException w:name="List Table 7 Colorful Accent 2" w:uiPriority="52"/>
+    <w:lsdException w:name="List Table 1 Light Accent 3" w:uiPriority="46"/>
+    <w:lsdException w:name="List Table 2 Accent 3" w:uiPriority="47"/>
+    <w:lsdException w:name="List Table 3 Accent 3" w:uiPriority="48"/>
+    <w:lsdException w:name="List Table 4 Accent 3" w:uiPriority="49"/>
+    <w:lsdException w:name="List Table 5 Dark Accent 3" w:uiPriority="50"/>
+    <w:lsdException w:name="List Table 6 Colorful Accent 3" w:uiPriority="51"/>
+    <w:lsdException w:name="List Table 7 Colorful Accent 3" w:uiPriority="52"/>
+    <w:lsdException w:name="List Table 1 Light Accent 4" w:uiPriority="46"/>
+    <w:lsdException w:name="List Table 2 Accent 4" w:uiPriority="47"/>
+    <w:lsdException w:name="List Table 3 Accent 4" w:uiPriority="48"/>
+    <w:lsdException w:name="List Table 4 Accent 4" w:uiPriority="49"/>
+    <w:lsdException w:name="List Table 5 Dark Accent 4" w:uiPriority="50"/>
+    <w:lsdException w:name="List Table 6 Colorful Accent 4" w:uiPriority="51"/>
+    <w:lsdException w:name="List Table 7 Colorful Accent 4" w:uiPriority="52"/>
+    <w:lsdException w:name="List Table 1 Light Accent 5" w:uiPriority="46"/>
+    <w:lsdException w:name="List Table 2 Accent 5" w:uiPriority="47"/>
+    <w:lsdException w:name="List Table 3 Accent 5" w:uiPriority="48"/>
+    <w:lsdException w:name="List Table 4 Accent 5" w:uiPriority="49"/>
+    <w:lsdException w:name="List Table 5 Dark Accent 5" w:uiPriority="50"/>
+    <w:lsdException w:name="List Table 6 Colorful Accent 5" w:uiPriority="51"/>
+    <w:lsdException w:name="List Table 7 Colorful Accent 5" w:uiPriority="52"/>
+    <w:lsdException w:name="List Table 1 Light Accent 6" w:uiPriority="46"/>
+    <w:lsdException w:name="List Table 2 Accent 6" w:uiPriority="47"/>
+    <w:lsdException w:name="List Table 3 Accent 6" w:uiPriority="48"/>
+    <w:lsdException w:name="List Table 4 Accent 6" w:uiPriority="49"/>
+    <w:lsdException w:name="List Table 5 Dark Accent 6" w:uiPriority="50"/>
+    <w:lsdException w:name="List Table 6 Colorful Accent 6" w:uiPriority="51"/>
+    <w:lsdException w:name="List Table 7 Colorful Accent 6" w:uiPriority="52"/>
+    <w:lsdException w:name="Mention" w:semiHidden="1" w:unhideWhenUsed="1"/>
+    <w:lsdException w:name="Smart Hyperlink" w:semiHidden="1" w:unhideWhenUsed="1"/>
+    <w:lsdException w:name="Hashtag" w:semiHidden="1" w:unhideWhenUsed="1"/>
+    <w:lsdException w:name="Unresolved Mention" w:semiHidden="1" w:unhideWhenUsed="1"/>
+    <w:lsdException w:name="Smart Link" w:semiHidden="1" w:unhideWhenUsed="1"/>
+  </w:latentStyles>
+  <w:style w:type="paragraph" w:default="1" w:styleId="Normal">
+    <w:name w:val="Normal"/>
+    <w:qFormat/>
+    <w:rPr>
+      <w:rFonts w:ascii="Calibri" w:eastAsia="Calibri" w:hAnsi="Calibri" w:cs="Calibri"/>
+      <w:lang w:val="pt-PT"/>
+    </w:rPr>
+  </w:style>
+  <w:style w:type="paragraph" w:styleId="Ttulo1">
+    <w:name w:val="heading 1"/>
+    <w:basedOn w:val="Normal"/>
+    <w:uiPriority w:val="9"/>
+    <w:qFormat/>
+    <w:pPr>
+      <w:ind w:left="112"/>
+      <w:outlineLvl w:val="0"/>
+    </w:pPr>
+    <w:rPr>
+      <w:b/>
+      <w:bCs/>
+      <w:sz w:val="24"/>
+      <w:szCs w:val="24"/>
+    </w:rPr>
+  </w:style>
+  <w:style w:type="character" w:default="1" w:styleId="Fontepargpadro">
     <w:name w:val="Default Paragraph Font"/>
     <w:uiPriority w:val="1"/>
     <w:semiHidden/>
     <w:unhideWhenUsed/>
   </w:style>
-  <w:style w:type="table" w:styleId="TableNormal" w:default="1">
+  <w:style w:type="table" w:default="1" w:styleId="Tabelanormal">
     <w:name w:val="Normal Table"/>
-    <w:uiPriority w:val="2"/>
+    <w:uiPriority w:val="99"/>
     <w:semiHidden/>
     <w:unhideWhenUsed/>
-    <w:qFormat/>
     <w:tblPr>
       <w:tblInd w:w="0" w:type="dxa"/>
       <w:tblCellMar>
         <w:top w:w="0" w:type="dxa"/>
-        <w:left w:w="0" w:type="dxa"/>
+        <w:left w:w="108" w:type="dxa"/>
         <w:bottom w:w="0" w:type="dxa"/>
-        <w:right w:w="0" w:type="dxa"/>
+        <w:right w:w="108" w:type="dxa"/>
       </w:tblCellMar>
     </w:tblPr>
   </w:style>
-  <w:style w:type="numbering" w:styleId="NoList" w:default="1">
+  <w:style w:type="numbering" w:default="1" w:styleId="Semlista">
     <w:name w:val="No List"/>
     <w:uiPriority w:val="99"/>
     <w:semiHidden/>
     <w:unhideWhenUsed/>
   </w:style>
-  <w:style w:type="paragraph" w:styleId="Normal" w:default="1">
-    <w:name w:val="Normal"/>
-    <w:uiPriority w:val="1"/>
-    <w:qFormat/>
-    <w:pPr/>
-    <w:rPr>
-      <w:rFonts w:ascii="Calibri" w:hAnsi="Calibri" w:eastAsia="Calibri" w:cs="Calibri"/>
-      <w:lang w:val="pt-PT" w:eastAsia="en-US" w:bidi="ar-SA"/>
-    </w:rPr>
-  </w:style>
-  <w:style w:type="paragraph" w:styleId="BodyText">
+  <w:style w:type="paragraph" w:styleId="Corpodetexto">
     <w:name w:val="Body Text"/>
     <w:basedOn w:val="Normal"/>
     <w:uiPriority w:val="1"/>
     <w:qFormat/>
-    <w:pPr/>
-    <w:rPr>
-      <w:rFonts w:ascii="Calibri" w:hAnsi="Calibri" w:eastAsia="Calibri" w:cs="Calibri"/>
-      <w:sz w:val="22"/>
-      <w:szCs w:val="22"/>
-      <w:lang w:val="pt-PT" w:eastAsia="en-US" w:bidi="ar-SA"/>
-    </w:rPr>
   </w:style>
-  <w:style w:type="paragraph" w:styleId="Heading1">
-    <w:name w:val="heading 1"/>
-    <w:basedOn w:val="Normal"/>
-    <w:uiPriority w:val="1"/>
-    <w:qFormat/>
-    <w:pPr>
-      <w:ind w:left="112"/>
-      <w:outlineLvl w:val="1"/>
-    </w:pPr>
-    <w:rPr>
-      <w:rFonts w:ascii="Calibri" w:hAnsi="Calibri" w:eastAsia="Calibri" w:cs="Calibri"/>
-      <w:b/>
-      <w:bCs/>
-      <w:sz w:val="24"/>
-      <w:szCs w:val="24"/>
-      <w:lang w:val="pt-PT" w:eastAsia="en-US" w:bidi="ar-SA"/>
-    </w:rPr>
-  </w:style>
-  <w:style w:type="paragraph" w:styleId="ListParagraph">
+  <w:style w:type="paragraph" w:styleId="PargrafodaLista">
     <w:name w:val="List Paragraph"/>
     <w:basedOn w:val="Normal"/>
     <w:uiPriority w:val="1"/>
     <w:qFormat/>
-    <w:pPr/>
-    <w:rPr>
-      <w:lang w:val="pt-PT" w:eastAsia="en-US" w:bidi="ar-SA"/>
-    </w:rPr>
   </w:style>
-  <w:style w:type="paragraph" w:styleId="TableParagraph">
+  <w:style w:type="paragraph" w:customStyle="1" w:styleId="TableParagraph">
     <w:name w:val="Table Paragraph"/>
     <w:basedOn w:val="Normal"/>
     <w:uiPriority w:val="1"/>
     <w:qFormat/>
-    <w:pPr/>
-    <w:rPr>
-      <w:rFonts w:ascii="Calibri" w:hAnsi="Calibri" w:eastAsia="Calibri" w:cs="Calibri"/>
-      <w:lang w:val="pt-PT" w:eastAsia="en-US" w:bidi="ar-SA"/>
-    </w:rPr>
   </w:style>
 </w:styles>
 </file>

</xml_diff>